<commit_message>
Cambio de nombre de 'cuartil-estatura-02-schoice.Rmd' a 'schoice-cuartil-estatura-02.Rmd'
</commit_message>
<xml_diff>
--- a/06-Estadística-Y-Probabilidad/Pensamiento-Aleatorio/06-Medidas-De-Posición/salida/cuartil-estatura-02-schoice_1.docx
+++ b/06-Estadística-Y-Probabilidad/Pensamiento-Aleatorio/06-Medidas-De-Posición/salida/cuartil-estatura-02-schoice_1.docx
@@ -110,7 +110,7 @@
         <w:t xml:space="preserve">Porcentajes</w:t>
       </w:r>
     </w:p>
-    <w:bookmarkStart w:id="20" w:name="section"/>
+    <w:bookmarkStart w:id="100" w:name="section"/>
     <w:p>
       <w:pPr>
         <w:pStyle w:val="Heading1"/>
@@ -142,6 +142,144 @@
     </w:p>
     <w:p>
       <w:pPr>
+        <w:pStyle w:val="SourceCode"/>
+        <w:numPr>
+          <w:ilvl w:val="0"/>
+          <w:numId w:val="1000"/>
+        </w:numPr>
+      </w:pPr>
+      <w:r>
+        <w:rPr>
+          <w:rStyle w:val="VerbatimChar"/>
+        </w:rPr>
+        <w:t xml:space="preserve"># Crear tabla con los datos</w:t>
+      </w:r>
+      <w:r>
+        <w:br/>
+      </w:r>
+      <w:r>
+        <w:rPr>
+          <w:rStyle w:val="VerbatimChar"/>
+        </w:rPr>
+        <w:t xml:space="preserve">datos_tabla &lt;- data.frame(</w:t>
+      </w:r>
+      <w:r>
+        <w:br/>
+      </w:r>
+      <w:r>
+        <w:rPr>
+          <w:rStyle w:val="VerbatimChar"/>
+        </w:rPr>
+        <w:t xml:space="preserve">    "Estudiante" = 1:length(stats$datos_desordenados),</w:t>
+      </w:r>
+      <w:r>
+        <w:br/>
+      </w:r>
+      <w:r>
+        <w:rPr>
+          <w:rStyle w:val="VerbatimChar"/>
+        </w:rPr>
+        <w:t xml:space="preserve">    "Estatura (cm)" = stats$datos_desordenados</w:t>
+      </w:r>
+      <w:r>
+        <w:br/>
+      </w:r>
+      <w:r>
+        <w:rPr>
+          <w:rStyle w:val="VerbatimChar"/>
+        </w:rPr>
+        <w:t xml:space="preserve">)</w:t>
+      </w:r>
+      <w:r>
+        <w:br/>
+      </w:r>
+      <w:r>
+        <w:br/>
+      </w:r>
+      <w:r>
+        <w:rPr>
+          <w:rStyle w:val="VerbatimChar"/>
+        </w:rPr>
+        <w:t xml:space="preserve"># Configurar tabla usando xtable</w:t>
+      </w:r>
+      <w:r>
+        <w:br/>
+      </w:r>
+      <w:r>
+        <w:rPr>
+          <w:rStyle w:val="VerbatimChar"/>
+        </w:rPr>
+        <w:t xml:space="preserve">tabla_xtable &lt;- xtable(datos_tabla,</w:t>
+      </w:r>
+      <w:r>
+        <w:br/>
+      </w:r>
+      <w:r>
+        <w:rPr>
+          <w:rStyle w:val="VerbatimChar"/>
+        </w:rPr>
+        <w:t xml:space="preserve">                       align = c("l", "c", "c"),</w:t>
+      </w:r>
+      <w:r>
+        <w:br/>
+      </w:r>
+      <w:r>
+        <w:rPr>
+          <w:rStyle w:val="VerbatimChar"/>
+        </w:rPr>
+        <w:t xml:space="preserve">                       digits = c(0, 0, 1))  # Permitir un decimal en la estatura</w:t>
+      </w:r>
+      <w:r>
+        <w:br/>
+      </w:r>
+      <w:r>
+        <w:br/>
+      </w:r>
+      <w:r>
+        <w:rPr>
+          <w:rStyle w:val="VerbatimChar"/>
+        </w:rPr>
+        <w:t xml:space="preserve"># Imprimir tabla en formato HTML</w:t>
+      </w:r>
+      <w:r>
+        <w:br/>
+      </w:r>
+      <w:r>
+        <w:rPr>
+          <w:rStyle w:val="VerbatimChar"/>
+        </w:rPr>
+        <w:t xml:space="preserve">print(tabla_xtable, </w:t>
+      </w:r>
+      <w:r>
+        <w:br/>
+      </w:r>
+      <w:r>
+        <w:rPr>
+          <w:rStyle w:val="VerbatimChar"/>
+        </w:rPr>
+        <w:t xml:space="preserve">      type = "html",</w:t>
+      </w:r>
+      <w:r>
+        <w:br/>
+      </w:r>
+      <w:r>
+        <w:rPr>
+          <w:rStyle w:val="VerbatimChar"/>
+        </w:rPr>
+        <w:t xml:space="preserve">      include.rownames = FALSE,</w:t>
+      </w:r>
+      <w:r>
+        <w:br/>
+      </w:r>
+      <w:r>
+        <w:rPr>
+          <w:rStyle w:val="VerbatimChar"/>
+        </w:rPr>
+        <w:t xml:space="preserve">      html.table.attributes = 'border="1" cellpadding="5" cellspacing="0"')</w:t>
+      </w:r>
+    </w:p>
+    <w:p>
+      <w:pPr>
         <w:numPr>
           <w:ilvl w:val="0"/>
           <w:numId w:val="1000"/>
@@ -181,7 +319,7 @@
         </w:numPr>
       </w:pPr>
       <w:r>
-        <w:t xml:space="preserve">161</w:t>
+        <w:t xml:space="preserve">161.1</w:t>
       </w:r>
     </w:p>
     <w:p>
@@ -203,7 +341,7 @@
         </w:numPr>
       </w:pPr>
       <w:r>
-        <w:t xml:space="preserve">145</w:t>
+        <w:t xml:space="preserve">168.8</w:t>
       </w:r>
     </w:p>
     <w:p>
@@ -225,7 +363,7 @@
         </w:numPr>
       </w:pPr>
       <w:r>
-        <w:t xml:space="preserve">165</w:t>
+        <w:t xml:space="preserve">170.7</w:t>
       </w:r>
     </w:p>
     <w:p>
@@ -247,7 +385,7 @@
         </w:numPr>
       </w:pPr>
       <w:r>
-        <w:t xml:space="preserve">160</w:t>
+        <w:t xml:space="preserve">163.7</w:t>
       </w:r>
     </w:p>
     <w:p>
@@ -269,7 +407,7 @@
         </w:numPr>
       </w:pPr>
       <w:r>
-        <w:t xml:space="preserve">168</w:t>
+        <w:t xml:space="preserve">166.0</w:t>
       </w:r>
     </w:p>
     <w:p>
@@ -291,7 +429,7 @@
         </w:numPr>
       </w:pPr>
       <w:r>
-        <w:t xml:space="preserve">180</w:t>
+        <w:t xml:space="preserve">159.9</w:t>
       </w:r>
     </w:p>
     <w:p>
@@ -313,7 +451,7 @@
         </w:numPr>
       </w:pPr>
       <w:r>
-        <w:t xml:space="preserve">162</w:t>
+        <w:t xml:space="preserve">153.0</w:t>
       </w:r>
     </w:p>
     <w:p>
@@ -335,7 +473,7 @@
         </w:numPr>
       </w:pPr>
       <w:r>
-        <w:t xml:space="preserve">162</w:t>
+        <w:t xml:space="preserve">165.3</w:t>
       </w:r>
     </w:p>
     <w:p>
@@ -357,7 +495,7 @@
         </w:numPr>
       </w:pPr>
       <w:r>
-        <w:t xml:space="preserve">176</w:t>
+        <w:t xml:space="preserve">178.1</w:t>
       </w:r>
     </w:p>
     <w:p>
@@ -379,7 +517,7 @@
         </w:numPr>
       </w:pPr>
       <w:r>
-        <w:t xml:space="preserve">146</w:t>
+        <w:t xml:space="preserve">171.7</w:t>
       </w:r>
     </w:p>
     <w:p>
@@ -401,7 +539,7 @@
         </w:numPr>
       </w:pPr>
       <w:r>
-        <w:t xml:space="preserve">162</w:t>
+        <w:t xml:space="preserve">148.5</w:t>
       </w:r>
     </w:p>
     <w:p>
@@ -423,7 +561,7 @@
         </w:numPr>
       </w:pPr>
       <w:r>
-        <w:t xml:space="preserve">174</w:t>
+        <w:t xml:space="preserve">154.4</w:t>
       </w:r>
     </w:p>
     <w:p>
@@ -445,7 +583,7 @@
         </w:numPr>
       </w:pPr>
       <w:r>
-        <w:t xml:space="preserve">146</w:t>
+        <w:t xml:space="preserve">159.7</w:t>
       </w:r>
     </w:p>
     <w:p>
@@ -467,7 +605,7 @@
         </w:numPr>
       </w:pPr>
       <w:r>
-        <w:t xml:space="preserve">167</w:t>
+        <w:t xml:space="preserve">158.5</w:t>
       </w:r>
     </w:p>
     <w:p>
@@ -489,183 +627,7 @@
         </w:numPr>
       </w:pPr>
       <w:r>
-        <w:t xml:space="preserve">148</w:t>
-      </w:r>
-    </w:p>
-    <w:p>
-      <w:pPr>
-        <w:numPr>
-          <w:ilvl w:val="0"/>
-          <w:numId w:val="1000"/>
-        </w:numPr>
-      </w:pPr>
-      <w:r>
-        <w:t xml:space="preserve">16</w:t>
-      </w:r>
-    </w:p>
-    <w:p>
-      <w:pPr>
-        <w:numPr>
-          <w:ilvl w:val="0"/>
-          <w:numId w:val="1000"/>
-        </w:numPr>
-      </w:pPr>
-      <w:r>
-        <w:t xml:space="preserve">171</w:t>
-      </w:r>
-    </w:p>
-    <w:p>
-      <w:pPr>
-        <w:numPr>
-          <w:ilvl w:val="0"/>
-          <w:numId w:val="1000"/>
-        </w:numPr>
-      </w:pPr>
-      <w:r>
-        <w:t xml:space="preserve">17</w:t>
-      </w:r>
-    </w:p>
-    <w:p>
-      <w:pPr>
-        <w:numPr>
-          <w:ilvl w:val="0"/>
-          <w:numId w:val="1000"/>
-        </w:numPr>
-      </w:pPr>
-      <w:r>
-        <w:t xml:space="preserve">175</w:t>
-      </w:r>
-    </w:p>
-    <w:p>
-      <w:pPr>
-        <w:numPr>
-          <w:ilvl w:val="0"/>
-          <w:numId w:val="1000"/>
-        </w:numPr>
-      </w:pPr>
-      <w:r>
-        <w:t xml:space="preserve">18</w:t>
-      </w:r>
-    </w:p>
-    <w:p>
-      <w:pPr>
-        <w:numPr>
-          <w:ilvl w:val="0"/>
-          <w:numId w:val="1000"/>
-        </w:numPr>
-      </w:pPr>
-      <w:r>
-        <w:t xml:space="preserve">164</w:t>
-      </w:r>
-    </w:p>
-    <w:p>
-      <w:pPr>
-        <w:numPr>
-          <w:ilvl w:val="0"/>
-          <w:numId w:val="1000"/>
-        </w:numPr>
-      </w:pPr>
-      <w:r>
-        <w:t xml:space="preserve">19</w:t>
-      </w:r>
-    </w:p>
-    <w:p>
-      <w:pPr>
-        <w:numPr>
-          <w:ilvl w:val="0"/>
-          <w:numId w:val="1000"/>
-        </w:numPr>
-      </w:pPr>
-      <w:r>
-        <w:t xml:space="preserve">181</w:t>
-      </w:r>
-    </w:p>
-    <w:p>
-      <w:pPr>
-        <w:numPr>
-          <w:ilvl w:val="0"/>
-          <w:numId w:val="1000"/>
-        </w:numPr>
-      </w:pPr>
-      <w:r>
-        <w:t xml:space="preserve">20</w:t>
-      </w:r>
-    </w:p>
-    <w:p>
-      <w:pPr>
-        <w:numPr>
-          <w:ilvl w:val="0"/>
-          <w:numId w:val="1000"/>
-        </w:numPr>
-      </w:pPr>
-      <w:r>
-        <w:t xml:space="preserve">173</w:t>
-      </w:r>
-    </w:p>
-    <w:p>
-      <w:pPr>
-        <w:numPr>
-          <w:ilvl w:val="0"/>
-          <w:numId w:val="1000"/>
-        </w:numPr>
-      </w:pPr>
-      <w:r>
-        <w:t xml:space="preserve">21</w:t>
-      </w:r>
-    </w:p>
-    <w:p>
-      <w:pPr>
-        <w:numPr>
-          <w:ilvl w:val="0"/>
-          <w:numId w:val="1000"/>
-        </w:numPr>
-      </w:pPr>
-      <w:r>
-        <w:t xml:space="preserve">146</w:t>
-      </w:r>
-    </w:p>
-    <w:p>
-      <w:pPr>
-        <w:numPr>
-          <w:ilvl w:val="0"/>
-          <w:numId w:val="1000"/>
-        </w:numPr>
-      </w:pPr>
-      <w:r>
-        <w:t xml:space="preserve">22</w:t>
-      </w:r>
-    </w:p>
-    <w:p>
-      <w:pPr>
-        <w:numPr>
-          <w:ilvl w:val="0"/>
-          <w:numId w:val="1000"/>
-        </w:numPr>
-      </w:pPr>
-      <w:r>
-        <w:t xml:space="preserve">153</w:t>
-      </w:r>
-    </w:p>
-    <w:p>
-      <w:pPr>
-        <w:numPr>
-          <w:ilvl w:val="0"/>
-          <w:numId w:val="1000"/>
-        </w:numPr>
-      </w:pPr>
-      <w:r>
-        <w:t xml:space="preserve">23</w:t>
-      </w:r>
-    </w:p>
-    <w:p>
-      <w:pPr>
-        <w:numPr>
-          <w:ilvl w:val="0"/>
-          <w:numId w:val="1000"/>
-        </w:numPr>
-      </w:pPr>
-      <w:r>
-        <w:t xml:space="preserve">168</w:t>
+        <w:t xml:space="preserve">159.7</w:t>
       </w:r>
     </w:p>
     <w:p>
@@ -687,10 +649,55 @@
         </w:numPr>
       </w:pPr>
       <w:r>
-        <w:rPr>
-          <w:rStyle w:val="VerbatimChar"/>
-        </w:rPr>
-        <w:t xml:space="preserve">{r DiagramaA, fig.width = 7, fig.height = 5, results=asis} # Configurar márgenes del gráfico par(mar = c(4, 4, 2, 6)) # Crear gráfico vacío para el diagrama # Calcular rango para dimensionar el gráfico rango &lt;- 240 - 223 y_min &lt;- 223 - rango * 0.15 y_max &lt;- 240 + rango * 0.15 plot(NA,       # Límites del eje x      xlim = c(0.5, 1.5),       # Límites del eje y calculados      ylim = c(y_min, y_max),      # Sin etiqueta para el eje x      xlab = "",       # Etiqueta para el eje y      ylab = "Estatura (cm)",       # Sin título      main = "",       # No mostrar ejes automáticamente      axes = FALSE) # Dibujar el diagrama de caja # Línea vertical central que va del mínimo al máximo segments(1, 223, 1, 240, lwd = 2) # Rectángulo (caja) desde Q1 hasta Q3 rect(0.8, 227, 1.2, 237, col = "white", border = "black") # Línea horizontal para la mediana dentro de la caja segments(0.8, 231, 1.2, 231, lwd = 2) # Líneas horizontales en los extremos (bigotes) para mínimo y máximo segments(c(0.8, 0.8), c(223, 240),         c(1.2, 1.2), c(223, 240), lwd = 2) # Agregar etiquetas de texto con los valores numéricos text(1.3, 223, paste("Mín =", 223), pos = 4, cex = 0.8) text(1.3, 227, paste("Q1 =", 227), pos = 4, cex = 0.8) text(1.3, 231, paste("Q2 =", 231), pos = 4, cex = 0.8) text(1.3, 237, paste("Q3 =", 237), pos = 4, cex = 0.8) text(1.3, 240, paste("Máx =", 240), pos = 4, cex = 0.8) # Añadir eje vertical y marco al gráfico axis(2, las = 1)  # Eje y con etiquetas horizontales box()  # Marco alrededor del gráfico</w:t>
+        <w:drawing>
+          <wp:inline>
+            <wp:extent cx="4800600" cy="3429000"/>
+            <wp:effectExtent b="0" l="0" r="0" t="0"/>
+            <wp:docPr descr="image" title="" id="21" name="Picture"/>
+            <a:graphic>
+              <a:graphicData uri="http://schemas.openxmlformats.org/drawingml/2006/picture">
+                <pic:pic>
+                  <pic:nvPicPr>
+                    <pic:cNvPr descr="media/supplements1/exercise1/DiagramaB-1.svg" id="22" name="Picture"/>
+                    <pic:cNvPicPr>
+                      <a:picLocks noChangeArrowheads="1" noChangeAspect="1"/>
+                    </pic:cNvPicPr>
+                  </pic:nvPicPr>
+                  <pic:blipFill>
+                    <a:blip r:embed="rId23">
+                      <a:extLst>
+                        <a:ext uri="{28A0092B-C50C-407E-A947-70E740481C1C}">
+                          <a14:useLocalDpi xmlns:a14="http://schemas.microsoft.com/office/drawing/2010/main" val="0"/>
+                        </a:ext>
+                        <a:ext uri="{96DAC541-7B7A-43D3-8B79-37D633B846F1}">
+                          <asvg:svgBlip xmlns:asvg="http://schemas.microsoft.com/office/drawing/2016/SVG/main" r:embed="rId20"/>
+                        </a:ext>
+                      </a:extLst>
+                    </a:blip>
+                    <a:stretch>
+                      <a:fillRect/>
+                    </a:stretch>
+                  </pic:blipFill>
+                  <pic:spPr bwMode="auto">
+                    <a:xfrm>
+                      <a:off x="0" y="0"/>
+                      <a:ext cx="4800600" cy="3429000"/>
+                    </a:xfrm>
+                    <a:prstGeom prst="rect">
+                      <a:avLst/>
+                    </a:prstGeom>
+                    <a:noFill/>
+                    <a:ln w="9525">
+                      <a:noFill/>
+                      <a:headEnd/>
+                      <a:tailEnd/>
+                    </a:ln>
+                  </pic:spPr>
+                </pic:pic>
+              </a:graphicData>
+            </a:graphic>
+          </wp:inline>
+        </w:drawing>
       </w:r>
     </w:p>
     <w:p>
@@ -701,10 +708,55 @@
         </w:numPr>
       </w:pPr>
       <w:r>
-        <w:rPr>
-          <w:rStyle w:val="VerbatimChar"/>
-        </w:rPr>
-        <w:t xml:space="preserve">{r DiagramaB, fig.width = 7, fig.height = 5, results=asis} # Configurar márgenes del gráfico par(mar = c(4, 4, 2, 6)) # Crear gráfico vacío para el diagrama # Calcular rango para dimensionar el gráfico rango &lt;- 364 - 276 y_min &lt;- 276 - rango * 0.15 y_max &lt;- 364 + rango * 0.15 plot(NA,       # Límites del eje x      xlim = c(0.5, 1.5),       # Límites del eje y calculados      ylim = c(y_min, y_max),      # Sin etiqueta para el eje x      xlab = "",       # Etiqueta para el eje y      ylab = "Estatura (cm)",       # Sin título      main = "",       # No mostrar ejes automáticamente      axes = FALSE) # Dibujar el diagrama de caja # Línea vertical central que va del mínimo al máximo segments(1, 276, 1, 364, lwd = 2) # Rectángulo (caja) desde Q1 hasta Q3 rect(0.8, 287, 1.2, 336, col = "white", border = "black") # Línea horizontal para la mediana dentro de la caja segments(0.8, 310, 1.2, 310, lwd = 2) # Líneas horizontales en los extremos (bigotes) para mínimo y máximo segments(c(0.8, 0.8), c(276, 364),         c(1.2, 1.2), c(276, 364), lwd = 2) # Agregar etiquetas de texto con los valores numéricos text(1.3, 276, paste("Mín =", 276), pos = 4, cex = 0.8) text(1.3, 287, paste("Q1 =", 287), pos = 4, cex = 0.8) text(1.3, 310, paste("Q2 =", 310), pos = 4, cex = 0.8) text(1.3, 336, paste("Q3 =", 336), pos = 4, cex = 0.8) text(1.3, 364, paste("Máx =", 364), pos = 4, cex = 0.8) # Añadir eje vertical y marco al gráfico axis(2, las = 1)  # Eje y con etiquetas horizontales box()  # Marco alrededor del gráfico</w:t>
+        <w:drawing>
+          <wp:inline>
+            <wp:extent cx="4800600" cy="3429000"/>
+            <wp:effectExtent b="0" l="0" r="0" t="0"/>
+            <wp:docPr descr="image" title="" id="25" name="Picture"/>
+            <a:graphic>
+              <a:graphicData uri="http://schemas.openxmlformats.org/drawingml/2006/picture">
+                <pic:pic>
+                  <pic:nvPicPr>
+                    <pic:cNvPr descr="media/supplements1/exercise1/DiagramaA-1.svg" id="26" name="Picture"/>
+                    <pic:cNvPicPr>
+                      <a:picLocks noChangeArrowheads="1" noChangeAspect="1"/>
+                    </pic:cNvPicPr>
+                  </pic:nvPicPr>
+                  <pic:blipFill>
+                    <a:blip r:embed="rId27">
+                      <a:extLst>
+                        <a:ext uri="{28A0092B-C50C-407E-A947-70E740481C1C}">
+                          <a14:useLocalDpi xmlns:a14="http://schemas.microsoft.com/office/drawing/2010/main" val="0"/>
+                        </a:ext>
+                        <a:ext uri="{96DAC541-7B7A-43D3-8B79-37D633B846F1}">
+                          <asvg:svgBlip xmlns:asvg="http://schemas.microsoft.com/office/drawing/2016/SVG/main" r:embed="rId24"/>
+                        </a:ext>
+                      </a:extLst>
+                    </a:blip>
+                    <a:stretch>
+                      <a:fillRect/>
+                    </a:stretch>
+                  </pic:blipFill>
+                  <pic:spPr bwMode="auto">
+                    <a:xfrm>
+                      <a:off x="0" y="0"/>
+                      <a:ext cx="4800600" cy="3429000"/>
+                    </a:xfrm>
+                    <a:prstGeom prst="rect">
+                      <a:avLst/>
+                    </a:prstGeom>
+                    <a:noFill/>
+                    <a:ln w="9525">
+                      <a:noFill/>
+                      <a:headEnd/>
+                      <a:tailEnd/>
+                    </a:ln>
+                  </pic:spPr>
+                </pic:pic>
+              </a:graphicData>
+            </a:graphic>
+          </wp:inline>
+        </w:drawing>
       </w:r>
     </w:p>
     <w:p>
@@ -715,10 +767,55 @@
         </w:numPr>
       </w:pPr>
       <w:r>
-        <w:rPr>
-          <w:rStyle w:val="VerbatimChar"/>
-        </w:rPr>
-        <w:t xml:space="preserve">{r DiagramaC, fig.width = 7, fig.height = 5, results=asis} # Configurar márgenes del gráfico par(mar = c(4, 4, 2, 6)) # Crear gráfico vacío para el diagrama # Calcular rango para dimensionar el gráfico rango &lt;- 172 - 155 y_min &lt;- 155 - rango * 0.15 y_max &lt;- 172 + rango * 0.15 plot(NA,       # Límites del eje x      xlim = c(0.5, 1.5),       # Límites del eje y calculados      ylim = c(y_min, y_max),      # Sin etiqueta para el eje x      xlab = "",       # Etiqueta para el eje y      ylab = "Estatura (cm)",       # Sin título      main = "",       # No mostrar ejes automáticamente      axes = FALSE) # Dibujar el diagrama de caja # Línea vertical central que va del mínimo al máximo segments(1, 155, 1, 172, lwd = 2) # Rectángulo (caja) desde Q1 hasta Q3 rect(0.8, 167, 1.2, 160, col = "white", border = "black") # Línea horizontal para la mediana dentro de la caja segments(0.8, 164, 1.2, 164, lwd = 2) # Líneas horizontales en los extremos (bigotes) para mínimo y máximo segments(c(0.8, 0.8), c(155, 172),         c(1.2, 1.2), c(155, 172), lwd = 2) # Agregar etiquetas de texto con los valores numéricos text(1.3, 155, paste("Mín =", 155), pos = 4, cex = 0.8) text(1.3, 167, paste("Q1 =", 167), pos = 4, cex = 0.8) text(1.3, 164, paste("Q2 =", 164), pos = 4, cex = 0.8) text(1.3, 160, paste("Q3 =", 160), pos = 4, cex = 0.8) text(1.3, 172, paste("Máx =", 172), pos = 4, cex = 0.8) # Añadir eje vertical y marco al gráfico axis(2, las = 1)  # Eje y con etiquetas horizontales box()  # Marco alrededor del gráfico</w:t>
+        <w:drawing>
+          <wp:inline>
+            <wp:extent cx="4800600" cy="3429000"/>
+            <wp:effectExtent b="0" l="0" r="0" t="0"/>
+            <wp:docPr descr="image" title="" id="29" name="Picture"/>
+            <a:graphic>
+              <a:graphicData uri="http://schemas.openxmlformats.org/drawingml/2006/picture">
+                <pic:pic>
+                  <pic:nvPicPr>
+                    <pic:cNvPr descr="media/supplements1/exercise1/DiagramaC-1.svg" id="30" name="Picture"/>
+                    <pic:cNvPicPr>
+                      <a:picLocks noChangeArrowheads="1" noChangeAspect="1"/>
+                    </pic:cNvPicPr>
+                  </pic:nvPicPr>
+                  <pic:blipFill>
+                    <a:blip r:embed="rId31">
+                      <a:extLst>
+                        <a:ext uri="{28A0092B-C50C-407E-A947-70E740481C1C}">
+                          <a14:useLocalDpi xmlns:a14="http://schemas.microsoft.com/office/drawing/2010/main" val="0"/>
+                        </a:ext>
+                        <a:ext uri="{96DAC541-7B7A-43D3-8B79-37D633B846F1}">
+                          <asvg:svgBlip xmlns:asvg="http://schemas.microsoft.com/office/drawing/2016/SVG/main" r:embed="rId28"/>
+                        </a:ext>
+                      </a:extLst>
+                    </a:blip>
+                    <a:stretch>
+                      <a:fillRect/>
+                    </a:stretch>
+                  </pic:blipFill>
+                  <pic:spPr bwMode="auto">
+                    <a:xfrm>
+                      <a:off x="0" y="0"/>
+                      <a:ext cx="4800600" cy="3429000"/>
+                    </a:xfrm>
+                    <a:prstGeom prst="rect">
+                      <a:avLst/>
+                    </a:prstGeom>
+                    <a:noFill/>
+                    <a:ln w="9525">
+                      <a:noFill/>
+                      <a:headEnd/>
+                      <a:tailEnd/>
+                    </a:ln>
+                  </pic:spPr>
+                </pic:pic>
+              </a:graphicData>
+            </a:graphic>
+          </wp:inline>
+        </w:drawing>
       </w:r>
     </w:p>
     <w:p>
@@ -729,10 +826,55 @@
         </w:numPr>
       </w:pPr>
       <w:r>
-        <w:rPr>
-          <w:rStyle w:val="VerbatimChar"/>
-        </w:rPr>
-        <w:t xml:space="preserve">{r DiagramaD, fig.width = 7, fig.height = 5, results=asis} # Configurar márgenes del gráfico par(mar = c(4, 4, 2, 6)) # Crear gráfico vacío para el diagrama # Calcular rango para dimensionar el gráfico rango &lt;- 181 - 145 y_min &lt;- 145 - rango * 0.15 y_max &lt;- 181 + rango * 0.15 plot(NA,       # Límites del eje x      xlim = c(0.5, 1.5),       # Límites del eje y calculados      ylim = c(y_min, y_max),      # Sin etiqueta para el eje x      xlab = "",       # Etiqueta para el eje y      ylab = "Estatura (cm)",       # Sin título      main = "",       # No mostrar ejes automáticamente      axes = FALSE) # Dibujar el diagrama de caja # Línea vertical central que va del mínimo al máximo segments(1, 145, 1, 181, lwd = 2) # Rectángulo (caja) desde Q1 hasta Q3 rect(0.8, 153, 1.2, 173, col = "white", border = "black") # Línea horizontal para la mediana dentro de la caja segments(0.8, 164, 1.2, 164, lwd = 2) # Líneas horizontales en los extremos (bigotes) para mínimo y máximo segments(c(0.8, 0.8), c(145, 181),         c(1.2, 1.2), c(145, 181), lwd = 2) # Agregar etiquetas de texto con los valores numéricos text(1.3, 145, paste("Mín =", 145), pos = 4, cex = 0.8) text(1.3, 153, paste("Q1 =", 153), pos = 4, cex = 0.8) text(1.3, 164, paste("Q2 =", 164), pos = 4, cex = 0.8) text(1.3, 173, paste("Q3 =", 173), pos = 4, cex = 0.8) text(1.3, 181, paste("Máx =", 181), pos = 4, cex = 0.8) # Añadir eje vertical y marco al gráfico axis(2, las = 1)  # Eje y con etiquetas horizontales box()  # Marco alrededor del gráfico</w:t>
+        <w:drawing>
+          <wp:inline>
+            <wp:extent cx="4800600" cy="3429000"/>
+            <wp:effectExtent b="0" l="0" r="0" t="0"/>
+            <wp:docPr descr="image" title="" id="33" name="Picture"/>
+            <a:graphic>
+              <a:graphicData uri="http://schemas.openxmlformats.org/drawingml/2006/picture">
+                <pic:pic>
+                  <pic:nvPicPr>
+                    <pic:cNvPr descr="media/supplements1/exercise1/DiagramaD-1.svg" id="34" name="Picture"/>
+                    <pic:cNvPicPr>
+                      <a:picLocks noChangeArrowheads="1" noChangeAspect="1"/>
+                    </pic:cNvPicPr>
+                  </pic:nvPicPr>
+                  <pic:blipFill>
+                    <a:blip r:embed="rId35">
+                      <a:extLst>
+                        <a:ext uri="{28A0092B-C50C-407E-A947-70E740481C1C}">
+                          <a14:useLocalDpi xmlns:a14="http://schemas.microsoft.com/office/drawing/2010/main" val="0"/>
+                        </a:ext>
+                        <a:ext uri="{96DAC541-7B7A-43D3-8B79-37D633B846F1}">
+                          <asvg:svgBlip xmlns:asvg="http://schemas.microsoft.com/office/drawing/2016/SVG/main" r:embed="rId32"/>
+                        </a:ext>
+                      </a:extLst>
+                    </a:blip>
+                    <a:stretch>
+                      <a:fillRect/>
+                    </a:stretch>
+                  </pic:blipFill>
+                  <pic:spPr bwMode="auto">
+                    <a:xfrm>
+                      <a:off x="0" y="0"/>
+                      <a:ext cx="4800600" cy="3429000"/>
+                    </a:xfrm>
+                    <a:prstGeom prst="rect">
+                      <a:avLst/>
+                    </a:prstGeom>
+                    <a:noFill/>
+                    <a:ln w="9525">
+                      <a:noFill/>
+                      <a:headEnd/>
+                      <a:tailEnd/>
+                    </a:ln>
+                  </pic:spPr>
+                </pic:pic>
+              </a:graphicData>
+            </a:graphic>
+          </wp:inline>
+        </w:drawing>
       </w:r>
     </w:p>
     <w:p>
@@ -764,7 +906,7 @@
         </w:numPr>
       </w:pPr>
       <w:r>
-        <w:t xml:space="preserve">Mínimo: 145 cm</w:t>
+        <w:t xml:space="preserve">Mínimo: 148.5 cm</w:t>
       </w:r>
     </w:p>
     <w:p>
@@ -775,7 +917,7 @@
         </w:numPr>
       </w:pPr>
       <w:r>
-        <w:t xml:space="preserve">Q1: 153 cm</w:t>
+        <w:t xml:space="preserve">Q1 (primer cuartil): 159.1 cm</w:t>
       </w:r>
     </w:p>
     <w:p>
@@ -786,7 +928,7 @@
         </w:numPr>
       </w:pPr>
       <w:r>
-        <w:t xml:space="preserve">Q2 = Mediana: 164 cm</w:t>
+        <w:t xml:space="preserve">Q2 (mediana): 161.1 cm</w:t>
       </w:r>
     </w:p>
     <w:p>
@@ -797,7 +939,7 @@
         </w:numPr>
       </w:pPr>
       <w:r>
-        <w:t xml:space="preserve">Q3: 173 cm</w:t>
+        <w:t xml:space="preserve">Q3 (tercer cuartil): 167.4 cm</w:t>
       </w:r>
     </w:p>
     <w:p>
@@ -808,18 +950,18 @@
         </w:numPr>
       </w:pPr>
       <w:r>
-        <w:t xml:space="preserve">Máximo: 181 cm</w:t>
-      </w:r>
-    </w:p>
-    <w:p>
-      <w:pPr>
-        <w:numPr>
-          <w:ilvl w:val="0"/>
-          <w:numId w:val="1000"/>
-        </w:numPr>
-      </w:pPr>
-      <w:r>
-        <w:t xml:space="preserve">La opción correcta es aquella cuyo diagrama muestra exactamente estos valores. Cada uno de los diagramas incorrectos presenta alguna inconsistencia con estos valores estadísticos.</w:t>
+        <w:t xml:space="preserve">Máximo: 178.1 cm</w:t>
+      </w:r>
+    </w:p>
+    <w:p>
+      <w:pPr>
+        <w:numPr>
+          <w:ilvl w:val="0"/>
+          <w:numId w:val="1000"/>
+        </w:numPr>
+      </w:pPr>
+      <w:r>
+        <w:t xml:space="preserve">La opción correcta es aquella cuyo diagrama muestra exactamente estos valores.</w:t>
       </w:r>
     </w:p>
     <w:p>
@@ -830,7 +972,7 @@
         </w:numPr>
       </w:pPr>
       <w:r>
-        <w:t xml:space="preserve">Incorrecto. Este diagrama no representa correctamente los valores estadísticos.</w:t>
+        <w:t xml:space="preserve">Correcto. Este diagrama representa fielmente todos los valores estadísticos.</w:t>
       </w:r>
     </w:p>
     <w:p>
@@ -841,7 +983,7 @@
         </w:numPr>
       </w:pPr>
       <w:r>
-        <w:t xml:space="preserve">Incorrecto. Este diagrama no representa correctamente los valores estadísticos.</w:t>
+        <w:t xml:space="preserve">Incorrecto. Los valores están multiplicados por 10.</w:t>
       </w:r>
     </w:p>
     <w:p>
@@ -852,7 +994,7 @@
         </w:numPr>
       </w:pPr>
       <w:r>
-        <w:t xml:space="preserve">Incorrecto. Este diagrama no representa correctamente los valores estadísticos.</w:t>
+        <w:t xml:space="preserve">Incorrecto. La mediana está mal calculada.</w:t>
       </w:r>
     </w:p>
     <w:p>
@@ -863,7 +1005,7 @@
         </w:numPr>
       </w:pPr>
       <w:r>
-        <w:t xml:space="preserve">Correcto. Este diagrama representa fielmente todos los valores estadísticos calculados a partir de los datos.</w:t>
+        <w:t xml:space="preserve">Incorrecto. Los cuartiles Q1 y Q3 están invertidos.</w:t>
       </w:r>
     </w:p>
     <w:p>
@@ -889,6 +1031,144 @@
     </w:p>
     <w:p>
       <w:pPr>
+        <w:pStyle w:val="SourceCode"/>
+        <w:numPr>
+          <w:ilvl w:val="0"/>
+          <w:numId w:val="1000"/>
+        </w:numPr>
+      </w:pPr>
+      <w:r>
+        <w:rPr>
+          <w:rStyle w:val="VerbatimChar"/>
+        </w:rPr>
+        <w:t xml:space="preserve"># Crear tabla con los datos</w:t>
+      </w:r>
+      <w:r>
+        <w:br/>
+      </w:r>
+      <w:r>
+        <w:rPr>
+          <w:rStyle w:val="VerbatimChar"/>
+        </w:rPr>
+        <w:t xml:space="preserve">datos_tabla &lt;- data.frame(</w:t>
+      </w:r>
+      <w:r>
+        <w:br/>
+      </w:r>
+      <w:r>
+        <w:rPr>
+          <w:rStyle w:val="VerbatimChar"/>
+        </w:rPr>
+        <w:t xml:space="preserve">    "Estudiante" = 1:length(stats$datos_desordenados),</w:t>
+      </w:r>
+      <w:r>
+        <w:br/>
+      </w:r>
+      <w:r>
+        <w:rPr>
+          <w:rStyle w:val="VerbatimChar"/>
+        </w:rPr>
+        <w:t xml:space="preserve">    "Estatura (cm)" = stats$datos_desordenados</w:t>
+      </w:r>
+      <w:r>
+        <w:br/>
+      </w:r>
+      <w:r>
+        <w:rPr>
+          <w:rStyle w:val="VerbatimChar"/>
+        </w:rPr>
+        <w:t xml:space="preserve">)</w:t>
+      </w:r>
+      <w:r>
+        <w:br/>
+      </w:r>
+      <w:r>
+        <w:br/>
+      </w:r>
+      <w:r>
+        <w:rPr>
+          <w:rStyle w:val="VerbatimChar"/>
+        </w:rPr>
+        <w:t xml:space="preserve"># Configurar tabla usando xtable</w:t>
+      </w:r>
+      <w:r>
+        <w:br/>
+      </w:r>
+      <w:r>
+        <w:rPr>
+          <w:rStyle w:val="VerbatimChar"/>
+        </w:rPr>
+        <w:t xml:space="preserve">tabla_xtable &lt;- xtable(datos_tabla,</w:t>
+      </w:r>
+      <w:r>
+        <w:br/>
+      </w:r>
+      <w:r>
+        <w:rPr>
+          <w:rStyle w:val="VerbatimChar"/>
+        </w:rPr>
+        <w:t xml:space="preserve">                       align = c("l", "c", "c"),</w:t>
+      </w:r>
+      <w:r>
+        <w:br/>
+      </w:r>
+      <w:r>
+        <w:rPr>
+          <w:rStyle w:val="VerbatimChar"/>
+        </w:rPr>
+        <w:t xml:space="preserve">                       digits = c(0, 0, 1))  # Permitir un decimal en la estatura</w:t>
+      </w:r>
+      <w:r>
+        <w:br/>
+      </w:r>
+      <w:r>
+        <w:br/>
+      </w:r>
+      <w:r>
+        <w:rPr>
+          <w:rStyle w:val="VerbatimChar"/>
+        </w:rPr>
+        <w:t xml:space="preserve"># Imprimir tabla en formato HTML</w:t>
+      </w:r>
+      <w:r>
+        <w:br/>
+      </w:r>
+      <w:r>
+        <w:rPr>
+          <w:rStyle w:val="VerbatimChar"/>
+        </w:rPr>
+        <w:t xml:space="preserve">print(tabla_xtable, </w:t>
+      </w:r>
+      <w:r>
+        <w:br/>
+      </w:r>
+      <w:r>
+        <w:rPr>
+          <w:rStyle w:val="VerbatimChar"/>
+        </w:rPr>
+        <w:t xml:space="preserve">      type = "html",</w:t>
+      </w:r>
+      <w:r>
+        <w:br/>
+      </w:r>
+      <w:r>
+        <w:rPr>
+          <w:rStyle w:val="VerbatimChar"/>
+        </w:rPr>
+        <w:t xml:space="preserve">      include.rownames = FALSE,</w:t>
+      </w:r>
+      <w:r>
+        <w:br/>
+      </w:r>
+      <w:r>
+        <w:rPr>
+          <w:rStyle w:val="VerbatimChar"/>
+        </w:rPr>
+        <w:t xml:space="preserve">      html.table.attributes = 'border="1" cellpadding="5" cellspacing="0"')</w:t>
+      </w:r>
+    </w:p>
+    <w:p>
+      <w:pPr>
         <w:numPr>
           <w:ilvl w:val="0"/>
           <w:numId w:val="1000"/>
@@ -928,7 +1208,7 @@
         </w:numPr>
       </w:pPr>
       <w:r>
-        <w:t xml:space="preserve">159</w:t>
+        <w:t xml:space="preserve">195.1</w:t>
       </w:r>
     </w:p>
     <w:p>
@@ -950,7 +1230,7 @@
         </w:numPr>
       </w:pPr>
       <w:r>
-        <w:t xml:space="preserve">162</w:t>
+        <w:t xml:space="preserve">181.0</w:t>
       </w:r>
     </w:p>
     <w:p>
@@ -972,7 +1252,7 @@
         </w:numPr>
       </w:pPr>
       <w:r>
-        <w:t xml:space="preserve">152</w:t>
+        <w:t xml:space="preserve">165.8</w:t>
       </w:r>
     </w:p>
     <w:p>
@@ -994,7 +1274,7 @@
         </w:numPr>
       </w:pPr>
       <w:r>
-        <w:t xml:space="preserve">173</w:t>
+        <w:t xml:space="preserve">172.9</w:t>
       </w:r>
     </w:p>
     <w:p>
@@ -1016,7 +1296,7 @@
         </w:numPr>
       </w:pPr>
       <w:r>
-        <w:t xml:space="preserve">165</w:t>
+        <w:t xml:space="preserve">167.5</w:t>
       </w:r>
     </w:p>
     <w:p>
@@ -1038,7 +1318,7 @@
         </w:numPr>
       </w:pPr>
       <w:r>
-        <w:t xml:space="preserve">175</w:t>
+        <w:t xml:space="preserve">197.9</w:t>
       </w:r>
     </w:p>
     <w:p>
@@ -1060,7 +1340,7 @@
         </w:numPr>
       </w:pPr>
       <w:r>
-        <w:t xml:space="preserve">183</w:t>
+        <w:t xml:space="preserve">159.6</w:t>
       </w:r>
     </w:p>
     <w:p>
@@ -1082,7 +1362,7 @@
         </w:numPr>
       </w:pPr>
       <w:r>
-        <w:t xml:space="preserve">154</w:t>
+        <w:t xml:space="preserve">168.5</w:t>
       </w:r>
     </w:p>
     <w:p>
@@ -1104,7 +1384,7 @@
         </w:numPr>
       </w:pPr>
       <w:r>
-        <w:t xml:space="preserve">166</w:t>
+        <w:t xml:space="preserve">175.9</w:t>
       </w:r>
     </w:p>
     <w:p>
@@ -1126,7 +1406,7 @@
         </w:numPr>
       </w:pPr>
       <w:r>
-        <w:t xml:space="preserve">187</w:t>
+        <w:t xml:space="preserve">158.6</w:t>
       </w:r>
     </w:p>
     <w:p>
@@ -1148,7 +1428,7 @@
         </w:numPr>
       </w:pPr>
       <w:r>
-        <w:t xml:space="preserve">190</w:t>
+        <w:t xml:space="preserve">164.1</w:t>
       </w:r>
     </w:p>
     <w:p>
@@ -1170,7 +1450,7 @@
         </w:numPr>
       </w:pPr>
       <w:r>
-        <w:t xml:space="preserve">182</w:t>
+        <w:t xml:space="preserve">158.7</w:t>
       </w:r>
     </w:p>
     <w:p>
@@ -1192,7 +1472,7 @@
         </w:numPr>
       </w:pPr>
       <w:r>
-        <w:t xml:space="preserve">151</w:t>
+        <w:t xml:space="preserve">176.6</w:t>
       </w:r>
     </w:p>
     <w:p>
@@ -1214,73 +1494,7 @@
         </w:numPr>
       </w:pPr>
       <w:r>
-        <w:t xml:space="preserve">176</w:t>
-      </w:r>
-    </w:p>
-    <w:p>
-      <w:pPr>
-        <w:numPr>
-          <w:ilvl w:val="0"/>
-          <w:numId w:val="1000"/>
-        </w:numPr>
-      </w:pPr>
-      <w:r>
-        <w:t xml:space="preserve">15</w:t>
-      </w:r>
-    </w:p>
-    <w:p>
-      <w:pPr>
-        <w:numPr>
-          <w:ilvl w:val="0"/>
-          <w:numId w:val="1000"/>
-        </w:numPr>
-      </w:pPr>
-      <w:r>
-        <w:t xml:space="preserve">150</w:t>
-      </w:r>
-    </w:p>
-    <w:p>
-      <w:pPr>
-        <w:numPr>
-          <w:ilvl w:val="0"/>
-          <w:numId w:val="1000"/>
-        </w:numPr>
-      </w:pPr>
-      <w:r>
-        <w:t xml:space="preserve">16</w:t>
-      </w:r>
-    </w:p>
-    <w:p>
-      <w:pPr>
-        <w:numPr>
-          <w:ilvl w:val="0"/>
-          <w:numId w:val="1000"/>
-        </w:numPr>
-      </w:pPr>
-      <w:r>
-        <w:t xml:space="preserve">171</w:t>
-      </w:r>
-    </w:p>
-    <w:p>
-      <w:pPr>
-        <w:numPr>
-          <w:ilvl w:val="0"/>
-          <w:numId w:val="1000"/>
-        </w:numPr>
-      </w:pPr>
-      <w:r>
-        <w:t xml:space="preserve">17</w:t>
-      </w:r>
-    </w:p>
-    <w:p>
-      <w:pPr>
-        <w:numPr>
-          <w:ilvl w:val="0"/>
-          <w:numId w:val="1000"/>
-        </w:numPr>
-      </w:pPr>
-      <w:r>
-        <w:t xml:space="preserve">178</w:t>
+        <w:t xml:space="preserve">164.0</w:t>
       </w:r>
     </w:p>
     <w:p>
@@ -1302,10 +1516,55 @@
         </w:numPr>
       </w:pPr>
       <w:r>
-        <w:rPr>
-          <w:rStyle w:val="VerbatimChar"/>
-        </w:rPr>
-        <w:t xml:space="preserve">{r DiagramaC, fig.width = 7, fig.height = 5, results=asis} # Configurar márgenes del gráfico par(mar = c(4, 4, 2, 6)) # Crear gráfico vacío para el diagrama # Calcular rango para dimensionar el gráfico rango &lt;- 190 - 150 y_min &lt;- 150 - rango * 0.15 y_max &lt;- 190 + rango * 0.15 plot(NA,       # Límites del eje x      xlim = c(0.5, 1.5),       # Límites del eje y calculados      ylim = c(y_min, y_max),      # Sin etiqueta para el eje x      xlab = "",       # Etiqueta para el eje y      ylab = "Estatura (cm)",       # Sin título      main = "",       # No mostrar ejes automáticamente      axes = FALSE) # Dibujar el diagrama de caja # Línea vertical central que va del mínimo al máximo segments(1, 150, 1, 190, lwd = 2) # Rectángulo (caja) desde Q1 hasta Q3 rect(0.8, 159, 1.2, 178, col = "white", border = "black") # Línea horizontal para la mediana dentro de la caja segments(0.8, 171, 1.2, 171, lwd = 2) # Líneas horizontales en los extremos (bigotes) para mínimo y máximo segments(c(0.8, 0.8), c(150, 190),         c(1.2, 1.2), c(150, 190), lwd = 2) # Agregar etiquetas de texto con los valores numéricos text(1.3, 150, paste("Mín =", 150), pos = 4, cex = 0.8) text(1.3, 159, paste("Q1 =", 159), pos = 4, cex = 0.8) text(1.3, 171, paste("Q2 =", 171), pos = 4, cex = 0.8) text(1.3, 178, paste("Q3 =", 178), pos = 4, cex = 0.8) text(1.3, 190, paste("Máx =", 190), pos = 4, cex = 0.8) # Añadir eje vertical y marco al gráfico axis(2, las = 1)  # Eje y con etiquetas horizontales box()  # Marco alrededor del gráfico</w:t>
+        <w:drawing>
+          <wp:inline>
+            <wp:extent cx="4800600" cy="3429000"/>
+            <wp:effectExtent b="0" l="0" r="0" t="0"/>
+            <wp:docPr descr="image" title="" id="37" name="Picture"/>
+            <a:graphic>
+              <a:graphicData uri="http://schemas.openxmlformats.org/drawingml/2006/picture">
+                <pic:pic>
+                  <pic:nvPicPr>
+                    <pic:cNvPr descr="media/supplements1/exercise2/DiagramaB-1.svg" id="38" name="Picture"/>
+                    <pic:cNvPicPr>
+                      <a:picLocks noChangeArrowheads="1" noChangeAspect="1"/>
+                    </pic:cNvPicPr>
+                  </pic:nvPicPr>
+                  <pic:blipFill>
+                    <a:blip r:embed="rId39">
+                      <a:extLst>
+                        <a:ext uri="{28A0092B-C50C-407E-A947-70E740481C1C}">
+                          <a14:useLocalDpi xmlns:a14="http://schemas.microsoft.com/office/drawing/2010/main" val="0"/>
+                        </a:ext>
+                        <a:ext uri="{96DAC541-7B7A-43D3-8B79-37D633B846F1}">
+                          <asvg:svgBlip xmlns:asvg="http://schemas.microsoft.com/office/drawing/2016/SVG/main" r:embed="rId36"/>
+                        </a:ext>
+                      </a:extLst>
+                    </a:blip>
+                    <a:stretch>
+                      <a:fillRect/>
+                    </a:stretch>
+                  </pic:blipFill>
+                  <pic:spPr bwMode="auto">
+                    <a:xfrm>
+                      <a:off x="0" y="0"/>
+                      <a:ext cx="4800600" cy="3429000"/>
+                    </a:xfrm>
+                    <a:prstGeom prst="rect">
+                      <a:avLst/>
+                    </a:prstGeom>
+                    <a:noFill/>
+                    <a:ln w="9525">
+                      <a:noFill/>
+                      <a:headEnd/>
+                      <a:tailEnd/>
+                    </a:ln>
+                  </pic:spPr>
+                </pic:pic>
+              </a:graphicData>
+            </a:graphic>
+          </wp:inline>
+        </w:drawing>
       </w:r>
     </w:p>
     <w:p>
@@ -1316,10 +1575,55 @@
         </w:numPr>
       </w:pPr>
       <w:r>
-        <w:rPr>
-          <w:rStyle w:val="VerbatimChar"/>
-        </w:rPr>
-        <w:t xml:space="preserve">{r DiagramaD, fig.width = 7, fig.height = 5, results=asis} # Configurar márgenes del gráfico par(mar = c(4, 4, 2, 6)) # Crear gráfico vacío para el diagrama # Calcular rango para dimensionar el gráfico rango &lt;- 333 - 281 y_min &lt;- 281 - rango * 0.15 y_max &lt;- 333 + rango * 0.15 plot(NA,       # Límites del eje x      xlim = c(0.5, 1.5),       # Límites del eje y calculados      ylim = c(y_min, y_max),      # Sin etiqueta para el eje x      xlab = "",       # Etiqueta para el eje y      ylab = "Estatura (cm)",       # Sin título      main = "",       # No mostrar ejes automáticamente      axes = FALSE) # Dibujar el diagrama de caja # Línea vertical central que va del mínimo al máximo segments(1, 281, 1, 333, lwd = 2) # Rectángulo (caja) desde Q1 hasta Q3 rect(0.8, 298, 1.2, 321, col = "white", border = "black") # Línea horizontal para la mediana dentro de la caja segments(0.8, 310, 1.2, 310, lwd = 2) # Líneas horizontales en los extremos (bigotes) para mínimo y máximo segments(c(0.8, 0.8), c(281, 333),         c(1.2, 1.2), c(281, 333), lwd = 2) # Agregar etiquetas de texto con los valores numéricos text(1.3, 281, paste("Mín =", 281), pos = 4, cex = 0.8) text(1.3, 298, paste("Q1 =", 298), pos = 4, cex = 0.8) text(1.3, 310, paste("Q2 =", 310), pos = 4, cex = 0.8) text(1.3, 321, paste("Q3 =", 321), pos = 4, cex = 0.8) text(1.3, 333, paste("Máx =", 333), pos = 4, cex = 0.8) # Añadir eje vertical y marco al gráfico axis(2, las = 1)  # Eje y con etiquetas horizontales box()  # Marco alrededor del gráfico</w:t>
+        <w:drawing>
+          <wp:inline>
+            <wp:extent cx="4800600" cy="3429000"/>
+            <wp:effectExtent b="0" l="0" r="0" t="0"/>
+            <wp:docPr descr="image" title="" id="41" name="Picture"/>
+            <a:graphic>
+              <a:graphicData uri="http://schemas.openxmlformats.org/drawingml/2006/picture">
+                <pic:pic>
+                  <pic:nvPicPr>
+                    <pic:cNvPr descr="media/supplements1/exercise2/DiagramaC-1.svg" id="42" name="Picture"/>
+                    <pic:cNvPicPr>
+                      <a:picLocks noChangeArrowheads="1" noChangeAspect="1"/>
+                    </pic:cNvPicPr>
+                  </pic:nvPicPr>
+                  <pic:blipFill>
+                    <a:blip r:embed="rId43">
+                      <a:extLst>
+                        <a:ext uri="{28A0092B-C50C-407E-A947-70E740481C1C}">
+                          <a14:useLocalDpi xmlns:a14="http://schemas.microsoft.com/office/drawing/2010/main" val="0"/>
+                        </a:ext>
+                        <a:ext uri="{96DAC541-7B7A-43D3-8B79-37D633B846F1}">
+                          <asvg:svgBlip xmlns:asvg="http://schemas.microsoft.com/office/drawing/2016/SVG/main" r:embed="rId40"/>
+                        </a:ext>
+                      </a:extLst>
+                    </a:blip>
+                    <a:stretch>
+                      <a:fillRect/>
+                    </a:stretch>
+                  </pic:blipFill>
+                  <pic:spPr bwMode="auto">
+                    <a:xfrm>
+                      <a:off x="0" y="0"/>
+                      <a:ext cx="4800600" cy="3429000"/>
+                    </a:xfrm>
+                    <a:prstGeom prst="rect">
+                      <a:avLst/>
+                    </a:prstGeom>
+                    <a:noFill/>
+                    <a:ln w="9525">
+                      <a:noFill/>
+                      <a:headEnd/>
+                      <a:tailEnd/>
+                    </a:ln>
+                  </pic:spPr>
+                </pic:pic>
+              </a:graphicData>
+            </a:graphic>
+          </wp:inline>
+        </w:drawing>
       </w:r>
     </w:p>
     <w:p>
@@ -1330,10 +1634,55 @@
         </w:numPr>
       </w:pPr>
       <w:r>
-        <w:rPr>
-          <w:rStyle w:val="VerbatimChar"/>
-        </w:rPr>
-        <w:t xml:space="preserve">{r DiagramaA, fig.width = 7, fig.height = 5, results=asis} # Configurar márgenes del gráfico par(mar = c(4, 4, 2, 6)) # Crear gráfico vacío para el diagrama # Calcular rango para dimensionar el gráfico rango &lt;- 180 - 159 y_min &lt;- 159 - rango * 0.15 y_max &lt;- 180 + rango * 0.15 plot(NA,       # Límites del eje x      xlim = c(0.5, 1.5),       # Límites del eje y calculados      ylim = c(y_min, y_max),      # Sin etiqueta para el eje x      xlab = "",       # Etiqueta para el eje y      ylab = "Estatura (cm)",       # Sin título      main = "",       # No mostrar ejes automáticamente      axes = FALSE) # Dibujar el diagrama de caja # Línea vertical central que va del mínimo al máximo segments(1, 159, 1, 180, lwd = 2) # Rectángulo (caja) desde Q1 hasta Q3 rect(0.8, 175, 1.2, 164, col = "white", border = "black") # Línea horizontal para la mediana dentro de la caja segments(0.8, 170, 1.2, 170, lwd = 2) # Líneas horizontales en los extremos (bigotes) para mínimo y máximo segments(c(0.8, 0.8), c(159, 180),         c(1.2, 1.2), c(159, 180), lwd = 2) # Agregar etiquetas de texto con los valores numéricos text(1.3, 159, paste("Mín =", 159), pos = 4, cex = 0.8) text(1.3, 175, paste("Q1 =", 175), pos = 4, cex = 0.8) text(1.3, 170, paste("Q2 =", 170), pos = 4, cex = 0.8) text(1.3, 164, paste("Q3 =", 164), pos = 4, cex = 0.8) text(1.3, 180, paste("Máx =", 180), pos = 4, cex = 0.8) # Añadir eje vertical y marco al gráfico axis(2, las = 1)  # Eje y con etiquetas horizontales box()  # Marco alrededor del gráfico</w:t>
+        <w:drawing>
+          <wp:inline>
+            <wp:extent cx="4800600" cy="3429000"/>
+            <wp:effectExtent b="0" l="0" r="0" t="0"/>
+            <wp:docPr descr="image" title="" id="45" name="Picture"/>
+            <a:graphic>
+              <a:graphicData uri="http://schemas.openxmlformats.org/drawingml/2006/picture">
+                <pic:pic>
+                  <pic:nvPicPr>
+                    <pic:cNvPr descr="media/supplements1/exercise2/DiagramaD-1.svg" id="46" name="Picture"/>
+                    <pic:cNvPicPr>
+                      <a:picLocks noChangeArrowheads="1" noChangeAspect="1"/>
+                    </pic:cNvPicPr>
+                  </pic:nvPicPr>
+                  <pic:blipFill>
+                    <a:blip r:embed="rId47">
+                      <a:extLst>
+                        <a:ext uri="{28A0092B-C50C-407E-A947-70E740481C1C}">
+                          <a14:useLocalDpi xmlns:a14="http://schemas.microsoft.com/office/drawing/2010/main" val="0"/>
+                        </a:ext>
+                        <a:ext uri="{96DAC541-7B7A-43D3-8B79-37D633B846F1}">
+                          <asvg:svgBlip xmlns:asvg="http://schemas.microsoft.com/office/drawing/2016/SVG/main" r:embed="rId44"/>
+                        </a:ext>
+                      </a:extLst>
+                    </a:blip>
+                    <a:stretch>
+                      <a:fillRect/>
+                    </a:stretch>
+                  </pic:blipFill>
+                  <pic:spPr bwMode="auto">
+                    <a:xfrm>
+                      <a:off x="0" y="0"/>
+                      <a:ext cx="4800600" cy="3429000"/>
+                    </a:xfrm>
+                    <a:prstGeom prst="rect">
+                      <a:avLst/>
+                    </a:prstGeom>
+                    <a:noFill/>
+                    <a:ln w="9525">
+                      <a:noFill/>
+                      <a:headEnd/>
+                      <a:tailEnd/>
+                    </a:ln>
+                  </pic:spPr>
+                </pic:pic>
+              </a:graphicData>
+            </a:graphic>
+          </wp:inline>
+        </w:drawing>
       </w:r>
     </w:p>
     <w:p>
@@ -1344,10 +1693,55 @@
         </w:numPr>
       </w:pPr>
       <w:r>
-        <w:rPr>
-          <w:rStyle w:val="VerbatimChar"/>
-        </w:rPr>
-        <w:t xml:space="preserve">{r DiagramaB, fig.width = 7, fig.height = 5, results=asis} # Configurar márgenes del gráfico par(mar = c(4, 4, 2, 6)) # Crear gráfico vacío para el diagrama # Calcular rango para dimensionar el gráfico rango &lt;- 250 - 234 y_min &lt;- 234 - rango * 0.15 y_max &lt;- 250 + rango * 0.15 plot(NA,       # Límites del eje x      xlim = c(0.5, 1.5),       # Límites del eje y calculados      ylim = c(y_min, y_max),      # Sin etiqueta para el eje x      xlab = "",       # Etiqueta para el eje y      ylab = "Estatura (cm)",       # Sin título      main = "",       # No mostrar ejes automáticamente      axes = FALSE) # Dibujar el diagrama de caja # Línea vertical central que va del mínimo al máximo segments(1, 234, 1, 250, lwd = 2) # Rectángulo (caja) desde Q1 hasta Q3 rect(0.8, 236, 1.2, 246, col = "white", border = "black") # Línea horizontal para la mediana dentro de la caja segments(0.8, 239, 1.2, 239, lwd = 2) # Líneas horizontales en los extremos (bigotes) para mínimo y máximo segments(c(0.8, 0.8), c(234, 250),         c(1.2, 1.2), c(234, 250), lwd = 2) # Agregar etiquetas de texto con los valores numéricos text(1.3, 234, paste("Mín =", 234), pos = 4, cex = 0.8) text(1.3, 236, paste("Q1 =", 236), pos = 4, cex = 0.8) text(1.3, 239, paste("Q2 =", 239), pos = 4, cex = 0.8) text(1.3, 246, paste("Q3 =", 246), pos = 4, cex = 0.8) text(1.3, 250, paste("Máx =", 250), pos = 4, cex = 0.8) # Añadir eje vertical y marco al gráfico axis(2, las = 1)  # Eje y con etiquetas horizontales box()  # Marco alrededor del gráfico</w:t>
+        <w:drawing>
+          <wp:inline>
+            <wp:extent cx="4800600" cy="3429000"/>
+            <wp:effectExtent b="0" l="0" r="0" t="0"/>
+            <wp:docPr descr="image" title="" id="49" name="Picture"/>
+            <a:graphic>
+              <a:graphicData uri="http://schemas.openxmlformats.org/drawingml/2006/picture">
+                <pic:pic>
+                  <pic:nvPicPr>
+                    <pic:cNvPr descr="media/supplements1/exercise2/DiagramaA-1.svg" id="50" name="Picture"/>
+                    <pic:cNvPicPr>
+                      <a:picLocks noChangeArrowheads="1" noChangeAspect="1"/>
+                    </pic:cNvPicPr>
+                  </pic:nvPicPr>
+                  <pic:blipFill>
+                    <a:blip r:embed="rId51">
+                      <a:extLst>
+                        <a:ext uri="{28A0092B-C50C-407E-A947-70E740481C1C}">
+                          <a14:useLocalDpi xmlns:a14="http://schemas.microsoft.com/office/drawing/2010/main" val="0"/>
+                        </a:ext>
+                        <a:ext uri="{96DAC541-7B7A-43D3-8B79-37D633B846F1}">
+                          <asvg:svgBlip xmlns:asvg="http://schemas.microsoft.com/office/drawing/2016/SVG/main" r:embed="rId48"/>
+                        </a:ext>
+                      </a:extLst>
+                    </a:blip>
+                    <a:stretch>
+                      <a:fillRect/>
+                    </a:stretch>
+                  </pic:blipFill>
+                  <pic:spPr bwMode="auto">
+                    <a:xfrm>
+                      <a:off x="0" y="0"/>
+                      <a:ext cx="4800600" cy="3429000"/>
+                    </a:xfrm>
+                    <a:prstGeom prst="rect">
+                      <a:avLst/>
+                    </a:prstGeom>
+                    <a:noFill/>
+                    <a:ln w="9525">
+                      <a:noFill/>
+                      <a:headEnd/>
+                      <a:tailEnd/>
+                    </a:ln>
+                  </pic:spPr>
+                </pic:pic>
+              </a:graphicData>
+            </a:graphic>
+          </wp:inline>
+        </w:drawing>
       </w:r>
     </w:p>
     <w:p>
@@ -1379,7 +1773,7 @@
         </w:numPr>
       </w:pPr>
       <w:r>
-        <w:t xml:space="preserve">Mínimo: 150 cm</w:t>
+        <w:t xml:space="preserve">Mínimo: 158.6 cm</w:t>
       </w:r>
     </w:p>
     <w:p>
@@ -1390,7 +1784,7 @@
         </w:numPr>
       </w:pPr>
       <w:r>
-        <w:t xml:space="preserve">Q1: 159 cm</w:t>
+        <w:t xml:space="preserve">Q1 (primer cuartil): 164 cm</w:t>
       </w:r>
     </w:p>
     <w:p>
@@ -1401,7 +1795,7 @@
         </w:numPr>
       </w:pPr>
       <w:r>
-        <w:t xml:space="preserve">Q2 = Mediana: 171 cm</w:t>
+        <w:t xml:space="preserve">Q2 (mediana): 168 cm</w:t>
       </w:r>
     </w:p>
     <w:p>
@@ -1412,7 +1806,7 @@
         </w:numPr>
       </w:pPr>
       <w:r>
-        <w:t xml:space="preserve">Q3: 178 cm</w:t>
+        <w:t xml:space="preserve">Q3 (tercer cuartil): 176.4 cm</w:t>
       </w:r>
     </w:p>
     <w:p>
@@ -1423,18 +1817,18 @@
         </w:numPr>
       </w:pPr>
       <w:r>
-        <w:t xml:space="preserve">Máximo: 190 cm</w:t>
-      </w:r>
-    </w:p>
-    <w:p>
-      <w:pPr>
-        <w:numPr>
-          <w:ilvl w:val="0"/>
-          <w:numId w:val="1000"/>
-        </w:numPr>
-      </w:pPr>
-      <w:r>
-        <w:t xml:space="preserve">La opción correcta es aquella cuyo diagrama muestra exactamente estos valores. Cada uno de los diagramas incorrectos presenta alguna inconsistencia con estos valores estadísticos.</w:t>
+        <w:t xml:space="preserve">Máximo: 197.9 cm</w:t>
+      </w:r>
+    </w:p>
+    <w:p>
+      <w:pPr>
+        <w:numPr>
+          <w:ilvl w:val="0"/>
+          <w:numId w:val="1000"/>
+        </w:numPr>
+      </w:pPr>
+      <w:r>
+        <w:t xml:space="preserve">La opción correcta es aquella cuyo diagrama muestra exactamente estos valores.</w:t>
       </w:r>
     </w:p>
     <w:p>
@@ -1445,7 +1839,7 @@
         </w:numPr>
       </w:pPr>
       <w:r>
-        <w:t xml:space="preserve">Correcto. Este diagrama representa fielmente todos los valores estadísticos calculados a partir de los datos.</w:t>
+        <w:t xml:space="preserve">Correcto. Este diagrama representa fielmente todos los valores estadísticos.</w:t>
       </w:r>
     </w:p>
     <w:p>
@@ -1456,7 +1850,7 @@
         </w:numPr>
       </w:pPr>
       <w:r>
-        <w:t xml:space="preserve">Incorrecto. Este diagrama no representa correctamente los valores estadísticos.</w:t>
+        <w:t xml:space="preserve">Incorrecto. La mediana está mal calculada.</w:t>
       </w:r>
     </w:p>
     <w:p>
@@ -1467,7 +1861,7 @@
         </w:numPr>
       </w:pPr>
       <w:r>
-        <w:t xml:space="preserve">Incorrecto. Este diagrama no representa correctamente los valores estadísticos.</w:t>
+        <w:t xml:space="preserve">Incorrecto. Los cuartiles Q1 y Q3 están invertidos.</w:t>
       </w:r>
     </w:p>
     <w:p>
@@ -1478,7 +1872,7 @@
         </w:numPr>
       </w:pPr>
       <w:r>
-        <w:t xml:space="preserve">Incorrecto. Este diagrama no representa correctamente los valores estadísticos.</w:t>
+        <w:t xml:space="preserve">Incorrecto. Los valores están multiplicados por 10.</w:t>
       </w:r>
     </w:p>
     <w:p>
@@ -1504,6 +1898,144 @@
     </w:p>
     <w:p>
       <w:pPr>
+        <w:pStyle w:val="SourceCode"/>
+        <w:numPr>
+          <w:ilvl w:val="0"/>
+          <w:numId w:val="1000"/>
+        </w:numPr>
+      </w:pPr>
+      <w:r>
+        <w:rPr>
+          <w:rStyle w:val="VerbatimChar"/>
+        </w:rPr>
+        <w:t xml:space="preserve"># Crear tabla con los datos</w:t>
+      </w:r>
+      <w:r>
+        <w:br/>
+      </w:r>
+      <w:r>
+        <w:rPr>
+          <w:rStyle w:val="VerbatimChar"/>
+        </w:rPr>
+        <w:t xml:space="preserve">datos_tabla &lt;- data.frame(</w:t>
+      </w:r>
+      <w:r>
+        <w:br/>
+      </w:r>
+      <w:r>
+        <w:rPr>
+          <w:rStyle w:val="VerbatimChar"/>
+        </w:rPr>
+        <w:t xml:space="preserve">    "Estudiante" = 1:length(stats$datos_desordenados),</w:t>
+      </w:r>
+      <w:r>
+        <w:br/>
+      </w:r>
+      <w:r>
+        <w:rPr>
+          <w:rStyle w:val="VerbatimChar"/>
+        </w:rPr>
+        <w:t xml:space="preserve">    "Estatura (cm)" = stats$datos_desordenados</w:t>
+      </w:r>
+      <w:r>
+        <w:br/>
+      </w:r>
+      <w:r>
+        <w:rPr>
+          <w:rStyle w:val="VerbatimChar"/>
+        </w:rPr>
+        <w:t xml:space="preserve">)</w:t>
+      </w:r>
+      <w:r>
+        <w:br/>
+      </w:r>
+      <w:r>
+        <w:br/>
+      </w:r>
+      <w:r>
+        <w:rPr>
+          <w:rStyle w:val="VerbatimChar"/>
+        </w:rPr>
+        <w:t xml:space="preserve"># Configurar tabla usando xtable</w:t>
+      </w:r>
+      <w:r>
+        <w:br/>
+      </w:r>
+      <w:r>
+        <w:rPr>
+          <w:rStyle w:val="VerbatimChar"/>
+        </w:rPr>
+        <w:t xml:space="preserve">tabla_xtable &lt;- xtable(datos_tabla,</w:t>
+      </w:r>
+      <w:r>
+        <w:br/>
+      </w:r>
+      <w:r>
+        <w:rPr>
+          <w:rStyle w:val="VerbatimChar"/>
+        </w:rPr>
+        <w:t xml:space="preserve">                       align = c("l", "c", "c"),</w:t>
+      </w:r>
+      <w:r>
+        <w:br/>
+      </w:r>
+      <w:r>
+        <w:rPr>
+          <w:rStyle w:val="VerbatimChar"/>
+        </w:rPr>
+        <w:t xml:space="preserve">                       digits = c(0, 0, 1))  # Permitir un decimal en la estatura</w:t>
+      </w:r>
+      <w:r>
+        <w:br/>
+      </w:r>
+      <w:r>
+        <w:br/>
+      </w:r>
+      <w:r>
+        <w:rPr>
+          <w:rStyle w:val="VerbatimChar"/>
+        </w:rPr>
+        <w:t xml:space="preserve"># Imprimir tabla en formato HTML</w:t>
+      </w:r>
+      <w:r>
+        <w:br/>
+      </w:r>
+      <w:r>
+        <w:rPr>
+          <w:rStyle w:val="VerbatimChar"/>
+        </w:rPr>
+        <w:t xml:space="preserve">print(tabla_xtable, </w:t>
+      </w:r>
+      <w:r>
+        <w:br/>
+      </w:r>
+      <w:r>
+        <w:rPr>
+          <w:rStyle w:val="VerbatimChar"/>
+        </w:rPr>
+        <w:t xml:space="preserve">      type = "html",</w:t>
+      </w:r>
+      <w:r>
+        <w:br/>
+      </w:r>
+      <w:r>
+        <w:rPr>
+          <w:rStyle w:val="VerbatimChar"/>
+        </w:rPr>
+        <w:t xml:space="preserve">      include.rownames = FALSE,</w:t>
+      </w:r>
+      <w:r>
+        <w:br/>
+      </w:r>
+      <w:r>
+        <w:rPr>
+          <w:rStyle w:val="VerbatimChar"/>
+        </w:rPr>
+        <w:t xml:space="preserve">      html.table.attributes = 'border="1" cellpadding="5" cellspacing="0"')</w:t>
+      </w:r>
+    </w:p>
+    <w:p>
+      <w:pPr>
         <w:numPr>
           <w:ilvl w:val="0"/>
           <w:numId w:val="1000"/>
@@ -1543,7 +2075,7 @@
         </w:numPr>
       </w:pPr>
       <w:r>
-        <w:t xml:space="preserve">159</w:t>
+        <w:t xml:space="preserve">161.6</w:t>
       </w:r>
     </w:p>
     <w:p>
@@ -1565,7 +2097,7 @@
         </w:numPr>
       </w:pPr>
       <w:r>
-        <w:t xml:space="preserve">162</w:t>
+        <w:t xml:space="preserve">163.3</w:t>
       </w:r>
     </w:p>
     <w:p>
@@ -1587,7 +2119,7 @@
         </w:numPr>
       </w:pPr>
       <w:r>
-        <w:t xml:space="preserve">152</w:t>
+        <w:t xml:space="preserve">153.3</w:t>
       </w:r>
     </w:p>
     <w:p>
@@ -1609,7 +2141,7 @@
         </w:numPr>
       </w:pPr>
       <w:r>
-        <w:t xml:space="preserve">173</w:t>
+        <w:t xml:space="preserve">171.8</w:t>
       </w:r>
     </w:p>
     <w:p>
@@ -1631,7 +2163,7 @@
         </w:numPr>
       </w:pPr>
       <w:r>
-        <w:t xml:space="preserve">165</w:t>
+        <w:t xml:space="preserve">177.5</w:t>
       </w:r>
     </w:p>
     <w:p>
@@ -1653,7 +2185,7 @@
         </w:numPr>
       </w:pPr>
       <w:r>
-        <w:t xml:space="preserve">175</w:t>
+        <w:t xml:space="preserve">169.3</w:t>
       </w:r>
     </w:p>
     <w:p>
@@ -1675,7 +2207,7 @@
         </w:numPr>
       </w:pPr>
       <w:r>
-        <w:t xml:space="preserve">183</w:t>
+        <w:t xml:space="preserve">162.9</w:t>
       </w:r>
     </w:p>
     <w:p>
@@ -1697,7 +2229,7 @@
         </w:numPr>
       </w:pPr>
       <w:r>
-        <w:t xml:space="preserve">154</w:t>
+        <w:t xml:space="preserve">170.8</w:t>
       </w:r>
     </w:p>
     <w:p>
@@ -1719,7 +2251,7 @@
         </w:numPr>
       </w:pPr>
       <w:r>
-        <w:t xml:space="preserve">166</w:t>
+        <w:t xml:space="preserve">173.2</w:t>
       </w:r>
     </w:p>
     <w:p>
@@ -1741,7 +2273,7 @@
         </w:numPr>
       </w:pPr>
       <w:r>
-        <w:t xml:space="preserve">187</w:t>
+        <w:t xml:space="preserve">166.0</w:t>
       </w:r>
     </w:p>
     <w:p>
@@ -1763,139 +2295,7 @@
         </w:numPr>
       </w:pPr>
       <w:r>
-        <w:t xml:space="preserve">190</w:t>
-      </w:r>
-    </w:p>
-    <w:p>
-      <w:pPr>
-        <w:numPr>
-          <w:ilvl w:val="0"/>
-          <w:numId w:val="1000"/>
-        </w:numPr>
-      </w:pPr>
-      <w:r>
-        <w:t xml:space="preserve">12</w:t>
-      </w:r>
-    </w:p>
-    <w:p>
-      <w:pPr>
-        <w:numPr>
-          <w:ilvl w:val="0"/>
-          <w:numId w:val="1000"/>
-        </w:numPr>
-      </w:pPr>
-      <w:r>
-        <w:t xml:space="preserve">182</w:t>
-      </w:r>
-    </w:p>
-    <w:p>
-      <w:pPr>
-        <w:numPr>
-          <w:ilvl w:val="0"/>
-          <w:numId w:val="1000"/>
-        </w:numPr>
-      </w:pPr>
-      <w:r>
-        <w:t xml:space="preserve">13</w:t>
-      </w:r>
-    </w:p>
-    <w:p>
-      <w:pPr>
-        <w:numPr>
-          <w:ilvl w:val="0"/>
-          <w:numId w:val="1000"/>
-        </w:numPr>
-      </w:pPr>
-      <w:r>
-        <w:t xml:space="preserve">151</w:t>
-      </w:r>
-    </w:p>
-    <w:p>
-      <w:pPr>
-        <w:numPr>
-          <w:ilvl w:val="0"/>
-          <w:numId w:val="1000"/>
-        </w:numPr>
-      </w:pPr>
-      <w:r>
-        <w:t xml:space="preserve">14</w:t>
-      </w:r>
-    </w:p>
-    <w:p>
-      <w:pPr>
-        <w:numPr>
-          <w:ilvl w:val="0"/>
-          <w:numId w:val="1000"/>
-        </w:numPr>
-      </w:pPr>
-      <w:r>
-        <w:t xml:space="preserve">176</w:t>
-      </w:r>
-    </w:p>
-    <w:p>
-      <w:pPr>
-        <w:numPr>
-          <w:ilvl w:val="0"/>
-          <w:numId w:val="1000"/>
-        </w:numPr>
-      </w:pPr>
-      <w:r>
-        <w:t xml:space="preserve">15</w:t>
-      </w:r>
-    </w:p>
-    <w:p>
-      <w:pPr>
-        <w:numPr>
-          <w:ilvl w:val="0"/>
-          <w:numId w:val="1000"/>
-        </w:numPr>
-      </w:pPr>
-      <w:r>
-        <w:t xml:space="preserve">150</w:t>
-      </w:r>
-    </w:p>
-    <w:p>
-      <w:pPr>
-        <w:numPr>
-          <w:ilvl w:val="0"/>
-          <w:numId w:val="1000"/>
-        </w:numPr>
-      </w:pPr>
-      <w:r>
-        <w:t xml:space="preserve">16</w:t>
-      </w:r>
-    </w:p>
-    <w:p>
-      <w:pPr>
-        <w:numPr>
-          <w:ilvl w:val="0"/>
-          <w:numId w:val="1000"/>
-        </w:numPr>
-      </w:pPr>
-      <w:r>
-        <w:t xml:space="preserve">171</w:t>
-      </w:r>
-    </w:p>
-    <w:p>
-      <w:pPr>
-        <w:numPr>
-          <w:ilvl w:val="0"/>
-          <w:numId w:val="1000"/>
-        </w:numPr>
-      </w:pPr>
-      <w:r>
-        <w:t xml:space="preserve">17</w:t>
-      </w:r>
-    </w:p>
-    <w:p>
-      <w:pPr>
-        <w:numPr>
-          <w:ilvl w:val="0"/>
-          <w:numId w:val="1000"/>
-        </w:numPr>
-      </w:pPr>
-      <w:r>
-        <w:t xml:space="preserve">178</w:t>
+        <w:t xml:space="preserve">167.1</w:t>
       </w:r>
     </w:p>
     <w:p>
@@ -1917,10 +2317,55 @@
         </w:numPr>
       </w:pPr>
       <w:r>
-        <w:rPr>
-          <w:rStyle w:val="VerbatimChar"/>
-        </w:rPr>
-        <w:t xml:space="preserve">{r DiagramaC, fig.width = 7, fig.height = 5, results=asis} # Configurar márgenes del gráfico par(mar = c(4, 4, 2, 6)) # Crear gráfico vacío para el diagrama # Calcular rango para dimensionar el gráfico rango &lt;- 190 - 150 y_min &lt;- 150 - rango * 0.15 y_max &lt;- 190 + rango * 0.15 plot(NA,       # Límites del eje x      xlim = c(0.5, 1.5),       # Límites del eje y calculados      ylim = c(y_min, y_max),      # Sin etiqueta para el eje x      xlab = "",       # Etiqueta para el eje y      ylab = "Estatura (cm)",       # Sin título      main = "",       # No mostrar ejes automáticamente      axes = FALSE) # Dibujar el diagrama de caja # Línea vertical central que va del mínimo al máximo segments(1, 150, 1, 190, lwd = 2) # Rectángulo (caja) desde Q1 hasta Q3 rect(0.8, 159, 1.2, 178, col = "white", border = "black") # Línea horizontal para la mediana dentro de la caja segments(0.8, 171, 1.2, 171, lwd = 2) # Líneas horizontales en los extremos (bigotes) para mínimo y máximo segments(c(0.8, 0.8), c(150, 190),         c(1.2, 1.2), c(150, 190), lwd = 2) # Agregar etiquetas de texto con los valores numéricos text(1.3, 150, paste("Mín =", 150), pos = 4, cex = 0.8) text(1.3, 159, paste("Q1 =", 159), pos = 4, cex = 0.8) text(1.3, 171, paste("Q2 =", 171), pos = 4, cex = 0.8) text(1.3, 178, paste("Q3 =", 178), pos = 4, cex = 0.8) text(1.3, 190, paste("Máx =", 190), pos = 4, cex = 0.8) # Añadir eje vertical y marco al gráfico axis(2, las = 1)  # Eje y con etiquetas horizontales box()  # Marco alrededor del gráfico</w:t>
+        <w:drawing>
+          <wp:inline>
+            <wp:extent cx="4800600" cy="3429000"/>
+            <wp:effectExtent b="0" l="0" r="0" t="0"/>
+            <wp:docPr descr="image" title="" id="53" name="Picture"/>
+            <a:graphic>
+              <a:graphicData uri="http://schemas.openxmlformats.org/drawingml/2006/picture">
+                <pic:pic>
+                  <pic:nvPicPr>
+                    <pic:cNvPr descr="media/supplements1/exercise3/DiagramaD-1.svg" id="54" name="Picture"/>
+                    <pic:cNvPicPr>
+                      <a:picLocks noChangeArrowheads="1" noChangeAspect="1"/>
+                    </pic:cNvPicPr>
+                  </pic:nvPicPr>
+                  <pic:blipFill>
+                    <a:blip r:embed="rId55">
+                      <a:extLst>
+                        <a:ext uri="{28A0092B-C50C-407E-A947-70E740481C1C}">
+                          <a14:useLocalDpi xmlns:a14="http://schemas.microsoft.com/office/drawing/2010/main" val="0"/>
+                        </a:ext>
+                        <a:ext uri="{96DAC541-7B7A-43D3-8B79-37D633B846F1}">
+                          <asvg:svgBlip xmlns:asvg="http://schemas.microsoft.com/office/drawing/2016/SVG/main" r:embed="rId52"/>
+                        </a:ext>
+                      </a:extLst>
+                    </a:blip>
+                    <a:stretch>
+                      <a:fillRect/>
+                    </a:stretch>
+                  </pic:blipFill>
+                  <pic:spPr bwMode="auto">
+                    <a:xfrm>
+                      <a:off x="0" y="0"/>
+                      <a:ext cx="4800600" cy="3429000"/>
+                    </a:xfrm>
+                    <a:prstGeom prst="rect">
+                      <a:avLst/>
+                    </a:prstGeom>
+                    <a:noFill/>
+                    <a:ln w="9525">
+                      <a:noFill/>
+                      <a:headEnd/>
+                      <a:tailEnd/>
+                    </a:ln>
+                  </pic:spPr>
+                </pic:pic>
+              </a:graphicData>
+            </a:graphic>
+          </wp:inline>
+        </w:drawing>
       </w:r>
     </w:p>
     <w:p>
@@ -1931,10 +2376,55 @@
         </w:numPr>
       </w:pPr>
       <w:r>
-        <w:rPr>
-          <w:rStyle w:val="VerbatimChar"/>
-        </w:rPr>
-        <w:t xml:space="preserve">{r DiagramaD, fig.width = 7, fig.height = 5, results=asis} # Configurar márgenes del gráfico par(mar = c(4, 4, 2, 6)) # Crear gráfico vacío para el diagrama # Calcular rango para dimensionar el gráfico rango &lt;- 333 - 281 y_min &lt;- 281 - rango * 0.15 y_max &lt;- 333 + rango * 0.15 plot(NA,       # Límites del eje x      xlim = c(0.5, 1.5),       # Límites del eje y calculados      ylim = c(y_min, y_max),      # Sin etiqueta para el eje x      xlab = "",       # Etiqueta para el eje y      ylab = "Estatura (cm)",       # Sin título      main = "",       # No mostrar ejes automáticamente      axes = FALSE) # Dibujar el diagrama de caja # Línea vertical central que va del mínimo al máximo segments(1, 281, 1, 333, lwd = 2) # Rectángulo (caja) desde Q1 hasta Q3 rect(0.8, 298, 1.2, 321, col = "white", border = "black") # Línea horizontal para la mediana dentro de la caja segments(0.8, 310, 1.2, 310, lwd = 2) # Líneas horizontales en los extremos (bigotes) para mínimo y máximo segments(c(0.8, 0.8), c(281, 333),         c(1.2, 1.2), c(281, 333), lwd = 2) # Agregar etiquetas de texto con los valores numéricos text(1.3, 281, paste("Mín =", 281), pos = 4, cex = 0.8) text(1.3, 298, paste("Q1 =", 298), pos = 4, cex = 0.8) text(1.3, 310, paste("Q2 =", 310), pos = 4, cex = 0.8) text(1.3, 321, paste("Q3 =", 321), pos = 4, cex = 0.8) text(1.3, 333, paste("Máx =", 333), pos = 4, cex = 0.8) # Añadir eje vertical y marco al gráfico axis(2, las = 1)  # Eje y con etiquetas horizontales box()  # Marco alrededor del gráfico</w:t>
+        <w:drawing>
+          <wp:inline>
+            <wp:extent cx="4800600" cy="3429000"/>
+            <wp:effectExtent b="0" l="0" r="0" t="0"/>
+            <wp:docPr descr="image" title="" id="57" name="Picture"/>
+            <a:graphic>
+              <a:graphicData uri="http://schemas.openxmlformats.org/drawingml/2006/picture">
+                <pic:pic>
+                  <pic:nvPicPr>
+                    <pic:cNvPr descr="media/supplements1/exercise3/DiagramaB-1.svg" id="58" name="Picture"/>
+                    <pic:cNvPicPr>
+                      <a:picLocks noChangeArrowheads="1" noChangeAspect="1"/>
+                    </pic:cNvPicPr>
+                  </pic:nvPicPr>
+                  <pic:blipFill>
+                    <a:blip r:embed="rId59">
+                      <a:extLst>
+                        <a:ext uri="{28A0092B-C50C-407E-A947-70E740481C1C}">
+                          <a14:useLocalDpi xmlns:a14="http://schemas.microsoft.com/office/drawing/2010/main" val="0"/>
+                        </a:ext>
+                        <a:ext uri="{96DAC541-7B7A-43D3-8B79-37D633B846F1}">
+                          <asvg:svgBlip xmlns:asvg="http://schemas.microsoft.com/office/drawing/2016/SVG/main" r:embed="rId56"/>
+                        </a:ext>
+                      </a:extLst>
+                    </a:blip>
+                    <a:stretch>
+                      <a:fillRect/>
+                    </a:stretch>
+                  </pic:blipFill>
+                  <pic:spPr bwMode="auto">
+                    <a:xfrm>
+                      <a:off x="0" y="0"/>
+                      <a:ext cx="4800600" cy="3429000"/>
+                    </a:xfrm>
+                    <a:prstGeom prst="rect">
+                      <a:avLst/>
+                    </a:prstGeom>
+                    <a:noFill/>
+                    <a:ln w="9525">
+                      <a:noFill/>
+                      <a:headEnd/>
+                      <a:tailEnd/>
+                    </a:ln>
+                  </pic:spPr>
+                </pic:pic>
+              </a:graphicData>
+            </a:graphic>
+          </wp:inline>
+        </w:drawing>
       </w:r>
     </w:p>
     <w:p>
@@ -1945,10 +2435,55 @@
         </w:numPr>
       </w:pPr>
       <w:r>
-        <w:rPr>
-          <w:rStyle w:val="VerbatimChar"/>
-        </w:rPr>
-        <w:t xml:space="preserve">{r DiagramaA, fig.width = 7, fig.height = 5, results=asis} # Configurar márgenes del gráfico par(mar = c(4, 4, 2, 6)) # Crear gráfico vacío para el diagrama # Calcular rango para dimensionar el gráfico rango &lt;- 180 - 159 y_min &lt;- 159 - rango * 0.15 y_max &lt;- 180 + rango * 0.15 plot(NA,       # Límites del eje x      xlim = c(0.5, 1.5),       # Límites del eje y calculados      ylim = c(y_min, y_max),      # Sin etiqueta para el eje x      xlab = "",       # Etiqueta para el eje y      ylab = "Estatura (cm)",       # Sin título      main = "",       # No mostrar ejes automáticamente      axes = FALSE) # Dibujar el diagrama de caja # Línea vertical central que va del mínimo al máximo segments(1, 159, 1, 180, lwd = 2) # Rectángulo (caja) desde Q1 hasta Q3 rect(0.8, 175, 1.2, 164, col = "white", border = "black") # Línea horizontal para la mediana dentro de la caja segments(0.8, 170, 1.2, 170, lwd = 2) # Líneas horizontales en los extremos (bigotes) para mínimo y máximo segments(c(0.8, 0.8), c(159, 180),         c(1.2, 1.2), c(159, 180), lwd = 2) # Agregar etiquetas de texto con los valores numéricos text(1.3, 159, paste("Mín =", 159), pos = 4, cex = 0.8) text(1.3, 175, paste("Q1 =", 175), pos = 4, cex = 0.8) text(1.3, 170, paste("Q2 =", 170), pos = 4, cex = 0.8) text(1.3, 164, paste("Q3 =", 164), pos = 4, cex = 0.8) text(1.3, 180, paste("Máx =", 180), pos = 4, cex = 0.8) # Añadir eje vertical y marco al gráfico axis(2, las = 1)  # Eje y con etiquetas horizontales box()  # Marco alrededor del gráfico</w:t>
+        <w:drawing>
+          <wp:inline>
+            <wp:extent cx="4800600" cy="3429000"/>
+            <wp:effectExtent b="0" l="0" r="0" t="0"/>
+            <wp:docPr descr="image" title="" id="61" name="Picture"/>
+            <a:graphic>
+              <a:graphicData uri="http://schemas.openxmlformats.org/drawingml/2006/picture">
+                <pic:pic>
+                  <pic:nvPicPr>
+                    <pic:cNvPr descr="media/supplements1/exercise3/DiagramaC-1.svg" id="62" name="Picture"/>
+                    <pic:cNvPicPr>
+                      <a:picLocks noChangeArrowheads="1" noChangeAspect="1"/>
+                    </pic:cNvPicPr>
+                  </pic:nvPicPr>
+                  <pic:blipFill>
+                    <a:blip r:embed="rId63">
+                      <a:extLst>
+                        <a:ext uri="{28A0092B-C50C-407E-A947-70E740481C1C}">
+                          <a14:useLocalDpi xmlns:a14="http://schemas.microsoft.com/office/drawing/2010/main" val="0"/>
+                        </a:ext>
+                        <a:ext uri="{96DAC541-7B7A-43D3-8B79-37D633B846F1}">
+                          <asvg:svgBlip xmlns:asvg="http://schemas.microsoft.com/office/drawing/2016/SVG/main" r:embed="rId60"/>
+                        </a:ext>
+                      </a:extLst>
+                    </a:blip>
+                    <a:stretch>
+                      <a:fillRect/>
+                    </a:stretch>
+                  </pic:blipFill>
+                  <pic:spPr bwMode="auto">
+                    <a:xfrm>
+                      <a:off x="0" y="0"/>
+                      <a:ext cx="4800600" cy="3429000"/>
+                    </a:xfrm>
+                    <a:prstGeom prst="rect">
+                      <a:avLst/>
+                    </a:prstGeom>
+                    <a:noFill/>
+                    <a:ln w="9525">
+                      <a:noFill/>
+                      <a:headEnd/>
+                      <a:tailEnd/>
+                    </a:ln>
+                  </pic:spPr>
+                </pic:pic>
+              </a:graphicData>
+            </a:graphic>
+          </wp:inline>
+        </w:drawing>
       </w:r>
     </w:p>
     <w:p>
@@ -1959,10 +2494,55 @@
         </w:numPr>
       </w:pPr>
       <w:r>
-        <w:rPr>
-          <w:rStyle w:val="VerbatimChar"/>
-        </w:rPr>
-        <w:t xml:space="preserve">{r DiagramaB, fig.width = 7, fig.height = 5, results=asis} # Configurar márgenes del gráfico par(mar = c(4, 4, 2, 6)) # Crear gráfico vacío para el diagrama # Calcular rango para dimensionar el gráfico rango &lt;- 250 - 234 y_min &lt;- 234 - rango * 0.15 y_max &lt;- 250 + rango * 0.15 plot(NA,       # Límites del eje x      xlim = c(0.5, 1.5),       # Límites del eje y calculados      ylim = c(y_min, y_max),      # Sin etiqueta para el eje x      xlab = "",       # Etiqueta para el eje y      ylab = "Estatura (cm)",       # Sin título      main = "",       # No mostrar ejes automáticamente      axes = FALSE) # Dibujar el diagrama de caja # Línea vertical central que va del mínimo al máximo segments(1, 234, 1, 250, lwd = 2) # Rectángulo (caja) desde Q1 hasta Q3 rect(0.8, 236, 1.2, 246, col = "white", border = "black") # Línea horizontal para la mediana dentro de la caja segments(0.8, 239, 1.2, 239, lwd = 2) # Líneas horizontales en los extremos (bigotes) para mínimo y máximo segments(c(0.8, 0.8), c(234, 250),         c(1.2, 1.2), c(234, 250), lwd = 2) # Agregar etiquetas de texto con los valores numéricos text(1.3, 234, paste("Mín =", 234), pos = 4, cex = 0.8) text(1.3, 236, paste("Q1 =", 236), pos = 4, cex = 0.8) text(1.3, 239, paste("Q2 =", 239), pos = 4, cex = 0.8) text(1.3, 246, paste("Q3 =", 246), pos = 4, cex = 0.8) text(1.3, 250, paste("Máx =", 250), pos = 4, cex = 0.8) # Añadir eje vertical y marco al gráfico axis(2, las = 1)  # Eje y con etiquetas horizontales box()  # Marco alrededor del gráfico</w:t>
+        <w:drawing>
+          <wp:inline>
+            <wp:extent cx="4800600" cy="3429000"/>
+            <wp:effectExtent b="0" l="0" r="0" t="0"/>
+            <wp:docPr descr="image" title="" id="65" name="Picture"/>
+            <a:graphic>
+              <a:graphicData uri="http://schemas.openxmlformats.org/drawingml/2006/picture">
+                <pic:pic>
+                  <pic:nvPicPr>
+                    <pic:cNvPr descr="media/supplements1/exercise3/DiagramaA-1.svg" id="66" name="Picture"/>
+                    <pic:cNvPicPr>
+                      <a:picLocks noChangeArrowheads="1" noChangeAspect="1"/>
+                    </pic:cNvPicPr>
+                  </pic:nvPicPr>
+                  <pic:blipFill>
+                    <a:blip r:embed="rId67">
+                      <a:extLst>
+                        <a:ext uri="{28A0092B-C50C-407E-A947-70E740481C1C}">
+                          <a14:useLocalDpi xmlns:a14="http://schemas.microsoft.com/office/drawing/2010/main" val="0"/>
+                        </a:ext>
+                        <a:ext uri="{96DAC541-7B7A-43D3-8B79-37D633B846F1}">
+                          <asvg:svgBlip xmlns:asvg="http://schemas.microsoft.com/office/drawing/2016/SVG/main" r:embed="rId64"/>
+                        </a:ext>
+                      </a:extLst>
+                    </a:blip>
+                    <a:stretch>
+                      <a:fillRect/>
+                    </a:stretch>
+                  </pic:blipFill>
+                  <pic:spPr bwMode="auto">
+                    <a:xfrm>
+                      <a:off x="0" y="0"/>
+                      <a:ext cx="4800600" cy="3429000"/>
+                    </a:xfrm>
+                    <a:prstGeom prst="rect">
+                      <a:avLst/>
+                    </a:prstGeom>
+                    <a:noFill/>
+                    <a:ln w="9525">
+                      <a:noFill/>
+                      <a:headEnd/>
+                      <a:tailEnd/>
+                    </a:ln>
+                  </pic:spPr>
+                </pic:pic>
+              </a:graphicData>
+            </a:graphic>
+          </wp:inline>
+        </w:drawing>
       </w:r>
     </w:p>
     <w:p>
@@ -1994,7 +2574,7 @@
         </w:numPr>
       </w:pPr>
       <w:r>
-        <w:t xml:space="preserve">Mínimo: 150 cm</w:t>
+        <w:t xml:space="preserve">Mínimo: 153.3 cm</w:t>
       </w:r>
     </w:p>
     <w:p>
@@ -2005,7 +2585,7 @@
         </w:numPr>
       </w:pPr>
       <w:r>
-        <w:t xml:space="preserve">Q1: 159 cm</w:t>
+        <w:t xml:space="preserve">Q1 (primer cuartil): 163.1 cm</w:t>
       </w:r>
     </w:p>
     <w:p>
@@ -2016,7 +2596,7 @@
         </w:numPr>
       </w:pPr>
       <w:r>
-        <w:t xml:space="preserve">Q2 = Mediana: 171 cm</w:t>
+        <w:t xml:space="preserve">Q2 (mediana): 167.1 cm</w:t>
       </w:r>
     </w:p>
     <w:p>
@@ -2027,7 +2607,7 @@
         </w:numPr>
       </w:pPr>
       <w:r>
-        <w:t xml:space="preserve">Q3: 178 cm</w:t>
+        <w:t xml:space="preserve">Q3 (tercer cuartil): 171.3 cm</w:t>
       </w:r>
     </w:p>
     <w:p>
@@ -2038,18 +2618,18 @@
         </w:numPr>
       </w:pPr>
       <w:r>
-        <w:t xml:space="preserve">Máximo: 190 cm</w:t>
-      </w:r>
-    </w:p>
-    <w:p>
-      <w:pPr>
-        <w:numPr>
-          <w:ilvl w:val="0"/>
-          <w:numId w:val="1000"/>
-        </w:numPr>
-      </w:pPr>
-      <w:r>
-        <w:t xml:space="preserve">La opción correcta es aquella cuyo diagrama muestra exactamente estos valores. Cada uno de los diagramas incorrectos presenta alguna inconsistencia con estos valores estadísticos.</w:t>
+        <w:t xml:space="preserve">Máximo: 177.5 cm</w:t>
+      </w:r>
+    </w:p>
+    <w:p>
+      <w:pPr>
+        <w:numPr>
+          <w:ilvl w:val="0"/>
+          <w:numId w:val="1000"/>
+        </w:numPr>
+      </w:pPr>
+      <w:r>
+        <w:t xml:space="preserve">La opción correcta es aquella cuyo diagrama muestra exactamente estos valores.</w:t>
       </w:r>
     </w:p>
     <w:p>
@@ -2060,7 +2640,7 @@
         </w:numPr>
       </w:pPr>
       <w:r>
-        <w:t xml:space="preserve">Correcto. Este diagrama representa fielmente todos los valores estadísticos calculados a partir de los datos.</w:t>
+        <w:t xml:space="preserve">Correcto. Este diagrama representa fielmente todos los valores estadísticos.</w:t>
       </w:r>
     </w:p>
     <w:p>
@@ -2071,7 +2651,7 @@
         </w:numPr>
       </w:pPr>
       <w:r>
-        <w:t xml:space="preserve">Incorrecto. Este diagrama no representa correctamente los valores estadísticos.</w:t>
+        <w:t xml:space="preserve">Incorrecto. Los cuartiles Q1 y Q3 están invertidos.</w:t>
       </w:r>
     </w:p>
     <w:p>
@@ -2082,7 +2662,7 @@
         </w:numPr>
       </w:pPr>
       <w:r>
-        <w:t xml:space="preserve">Incorrecto. Este diagrama no representa correctamente los valores estadísticos.</w:t>
+        <w:t xml:space="preserve">Incorrecto. Los valores están multiplicados por 10.</w:t>
       </w:r>
     </w:p>
     <w:p>
@@ -2093,7 +2673,7 @@
         </w:numPr>
       </w:pPr>
       <w:r>
-        <w:t xml:space="preserve">Incorrecto. Este diagrama no representa correctamente los valores estadísticos.</w:t>
+        <w:t xml:space="preserve">Incorrecto. La mediana está mal calculada.</w:t>
       </w:r>
     </w:p>
     <w:p>
@@ -2119,6 +2699,144 @@
     </w:p>
     <w:p>
       <w:pPr>
+        <w:pStyle w:val="SourceCode"/>
+        <w:numPr>
+          <w:ilvl w:val="0"/>
+          <w:numId w:val="1000"/>
+        </w:numPr>
+      </w:pPr>
+      <w:r>
+        <w:rPr>
+          <w:rStyle w:val="VerbatimChar"/>
+        </w:rPr>
+        <w:t xml:space="preserve"># Crear tabla con los datos</w:t>
+      </w:r>
+      <w:r>
+        <w:br/>
+      </w:r>
+      <w:r>
+        <w:rPr>
+          <w:rStyle w:val="VerbatimChar"/>
+        </w:rPr>
+        <w:t xml:space="preserve">datos_tabla &lt;- data.frame(</w:t>
+      </w:r>
+      <w:r>
+        <w:br/>
+      </w:r>
+      <w:r>
+        <w:rPr>
+          <w:rStyle w:val="VerbatimChar"/>
+        </w:rPr>
+        <w:t xml:space="preserve">    "Estudiante" = 1:length(stats$datos_desordenados),</w:t>
+      </w:r>
+      <w:r>
+        <w:br/>
+      </w:r>
+      <w:r>
+        <w:rPr>
+          <w:rStyle w:val="VerbatimChar"/>
+        </w:rPr>
+        <w:t xml:space="preserve">    "Estatura (cm)" = stats$datos_desordenados</w:t>
+      </w:r>
+      <w:r>
+        <w:br/>
+      </w:r>
+      <w:r>
+        <w:rPr>
+          <w:rStyle w:val="VerbatimChar"/>
+        </w:rPr>
+        <w:t xml:space="preserve">)</w:t>
+      </w:r>
+      <w:r>
+        <w:br/>
+      </w:r>
+      <w:r>
+        <w:br/>
+      </w:r>
+      <w:r>
+        <w:rPr>
+          <w:rStyle w:val="VerbatimChar"/>
+        </w:rPr>
+        <w:t xml:space="preserve"># Configurar tabla usando xtable</w:t>
+      </w:r>
+      <w:r>
+        <w:br/>
+      </w:r>
+      <w:r>
+        <w:rPr>
+          <w:rStyle w:val="VerbatimChar"/>
+        </w:rPr>
+        <w:t xml:space="preserve">tabla_xtable &lt;- xtable(datos_tabla,</w:t>
+      </w:r>
+      <w:r>
+        <w:br/>
+      </w:r>
+      <w:r>
+        <w:rPr>
+          <w:rStyle w:val="VerbatimChar"/>
+        </w:rPr>
+        <w:t xml:space="preserve">                       align = c("l", "c", "c"),</w:t>
+      </w:r>
+      <w:r>
+        <w:br/>
+      </w:r>
+      <w:r>
+        <w:rPr>
+          <w:rStyle w:val="VerbatimChar"/>
+        </w:rPr>
+        <w:t xml:space="preserve">                       digits = c(0, 0, 1))  # Permitir un decimal en la estatura</w:t>
+      </w:r>
+      <w:r>
+        <w:br/>
+      </w:r>
+      <w:r>
+        <w:br/>
+      </w:r>
+      <w:r>
+        <w:rPr>
+          <w:rStyle w:val="VerbatimChar"/>
+        </w:rPr>
+        <w:t xml:space="preserve"># Imprimir tabla en formato HTML</w:t>
+      </w:r>
+      <w:r>
+        <w:br/>
+      </w:r>
+      <w:r>
+        <w:rPr>
+          <w:rStyle w:val="VerbatimChar"/>
+        </w:rPr>
+        <w:t xml:space="preserve">print(tabla_xtable, </w:t>
+      </w:r>
+      <w:r>
+        <w:br/>
+      </w:r>
+      <w:r>
+        <w:rPr>
+          <w:rStyle w:val="VerbatimChar"/>
+        </w:rPr>
+        <w:t xml:space="preserve">      type = "html",</w:t>
+      </w:r>
+      <w:r>
+        <w:br/>
+      </w:r>
+      <w:r>
+        <w:rPr>
+          <w:rStyle w:val="VerbatimChar"/>
+        </w:rPr>
+        <w:t xml:space="preserve">      include.rownames = FALSE,</w:t>
+      </w:r>
+      <w:r>
+        <w:br/>
+      </w:r>
+      <w:r>
+        <w:rPr>
+          <w:rStyle w:val="VerbatimChar"/>
+        </w:rPr>
+        <w:t xml:space="preserve">      html.table.attributes = 'border="1" cellpadding="5" cellspacing="0"')</w:t>
+      </w:r>
+    </w:p>
+    <w:p>
+      <w:pPr>
         <w:numPr>
           <w:ilvl w:val="0"/>
           <w:numId w:val="1000"/>
@@ -2158,7 +2876,7 @@
         </w:numPr>
       </w:pPr>
       <w:r>
-        <w:t xml:space="preserve">191</w:t>
+        <w:t xml:space="preserve">176.4</w:t>
       </w:r>
     </w:p>
     <w:p>
@@ -2180,7 +2898,7 @@
         </w:numPr>
       </w:pPr>
       <w:r>
-        <w:t xml:space="preserve">189</w:t>
+        <w:t xml:space="preserve">164.8</w:t>
       </w:r>
     </w:p>
     <w:p>
@@ -2202,7 +2920,7 @@
         </w:numPr>
       </w:pPr>
       <w:r>
-        <w:t xml:space="preserve">188</w:t>
+        <w:t xml:space="preserve">174.0</w:t>
       </w:r>
     </w:p>
     <w:p>
@@ -2224,7 +2942,7 @@
         </w:numPr>
       </w:pPr>
       <w:r>
-        <w:t xml:space="preserve">178</w:t>
+        <w:t xml:space="preserve">158.6</w:t>
       </w:r>
     </w:p>
     <w:p>
@@ -2246,7 +2964,7 @@
         </w:numPr>
       </w:pPr>
       <w:r>
-        <w:t xml:space="preserve">154</w:t>
+        <w:t xml:space="preserve">179.2</w:t>
       </w:r>
     </w:p>
     <w:p>
@@ -2268,7 +2986,7 @@
         </w:numPr>
       </w:pPr>
       <w:r>
-        <w:t xml:space="preserve">166</w:t>
+        <w:t xml:space="preserve">169.0</w:t>
       </w:r>
     </w:p>
     <w:p>
@@ -2290,7 +3008,7 @@
         </w:numPr>
       </w:pPr>
       <w:r>
-        <w:t xml:space="preserve">177</w:t>
+        <w:t xml:space="preserve">173.4</w:t>
       </w:r>
     </w:p>
     <w:p>
@@ -2312,7 +3030,7 @@
         </w:numPr>
       </w:pPr>
       <w:r>
-        <w:t xml:space="preserve">157</w:t>
+        <w:t xml:space="preserve">173.1</w:t>
       </w:r>
     </w:p>
     <w:p>
@@ -2334,7 +3052,7 @@
         </w:numPr>
       </w:pPr>
       <w:r>
-        <w:t xml:space="preserve">184</w:t>
+        <w:t xml:space="preserve">182.0</w:t>
       </w:r>
     </w:p>
     <w:p>
@@ -2356,7 +3074,7 @@
         </w:numPr>
       </w:pPr>
       <w:r>
-        <w:t xml:space="preserve">175</w:t>
+        <w:t xml:space="preserve">179.5</w:t>
       </w:r>
     </w:p>
     <w:p>
@@ -2378,51 +3096,7 @@
         </w:numPr>
       </w:pPr>
       <w:r>
-        <w:t xml:space="preserve">181</w:t>
-      </w:r>
-    </w:p>
-    <w:p>
-      <w:pPr>
-        <w:numPr>
-          <w:ilvl w:val="0"/>
-          <w:numId w:val="1000"/>
-        </w:numPr>
-      </w:pPr>
-      <w:r>
-        <w:t xml:space="preserve">12</w:t>
-      </w:r>
-    </w:p>
-    <w:p>
-      <w:pPr>
-        <w:numPr>
-          <w:ilvl w:val="0"/>
-          <w:numId w:val="1000"/>
-        </w:numPr>
-      </w:pPr>
-      <w:r>
-        <w:t xml:space="preserve">164</w:t>
-      </w:r>
-    </w:p>
-    <w:p>
-      <w:pPr>
-        <w:numPr>
-          <w:ilvl w:val="0"/>
-          <w:numId w:val="1000"/>
-        </w:numPr>
-      </w:pPr>
-      <w:r>
-        <w:t xml:space="preserve">13</w:t>
-      </w:r>
-    </w:p>
-    <w:p>
-      <w:pPr>
-        <w:numPr>
-          <w:ilvl w:val="0"/>
-          <w:numId w:val="1000"/>
-        </w:numPr>
-      </w:pPr>
-      <w:r>
-        <w:t xml:space="preserve">180</w:t>
+        <w:t xml:space="preserve">166.7</w:t>
       </w:r>
     </w:p>
     <w:p>
@@ -2444,10 +3118,55 @@
         </w:numPr>
       </w:pPr>
       <w:r>
-        <w:rPr>
-          <w:rStyle w:val="VerbatimChar"/>
-        </w:rPr>
-        <w:t xml:space="preserve">{r DiagramaA, fig.width = 7, fig.height = 5, results=asis} # Configurar márgenes del gráfico par(mar = c(4, 4, 2, 6)) # Crear gráfico vacío para el diagrama # Calcular rango para dimensionar el gráfico rango &lt;- 177 - 155 y_min &lt;- 155 - rango * 0.15 y_max &lt;- 177 + rango * 0.15 plot(NA,       # Límites del eje x      xlim = c(0.5, 1.5),       # Límites del eje y calculados      ylim = c(y_min, y_max),      # Sin etiqueta para el eje x      xlab = "",       # Etiqueta para el eje y      ylab = "Estatura (cm)",       # Sin título      main = "",       # No mostrar ejes automáticamente      axes = FALSE) # Dibujar el diagrama de caja # Línea vertical central que va del mínimo al máximo segments(1, 155, 1, 177, lwd = 2) # Rectángulo (caja) desde Q1 hasta Q3 rect(0.8, 159, 1.2, 168, col = "white", border = "black") # Línea horizontal para la mediana dentro de la caja segments(0.8, 160, 1.2, 160, lwd = 2) # Líneas horizontales en los extremos (bigotes) para mínimo y máximo segments(c(0.8, 0.8), c(155, 177),         c(1.2, 1.2), c(155, 177), lwd = 2) # Agregar etiquetas de texto con los valores numéricos text(1.3, 155, paste("Mín =", 155), pos = 4, cex = 0.8) text(1.3, 159, paste("Q1 =", 159), pos = 4, cex = 0.8) text(1.3, 160, paste("Q2 =", 160), pos = 4, cex = 0.8) text(1.3, 168, paste("Q3 =", 168), pos = 4, cex = 0.8) text(1.3, 177, paste("Máx =", 177), pos = 4, cex = 0.8) # Añadir eje vertical y marco al gráfico axis(2, las = 1)  # Eje y con etiquetas horizontales box()  # Marco alrededor del gráfico</w:t>
+        <w:drawing>
+          <wp:inline>
+            <wp:extent cx="4800600" cy="3429000"/>
+            <wp:effectExtent b="0" l="0" r="0" t="0"/>
+            <wp:docPr descr="image" title="" id="69" name="Picture"/>
+            <a:graphic>
+              <a:graphicData uri="http://schemas.openxmlformats.org/drawingml/2006/picture">
+                <pic:pic>
+                  <pic:nvPicPr>
+                    <pic:cNvPr descr="media/supplements1/exercise4/DiagramaD-1.svg" id="70" name="Picture"/>
+                    <pic:cNvPicPr>
+                      <a:picLocks noChangeArrowheads="1" noChangeAspect="1"/>
+                    </pic:cNvPicPr>
+                  </pic:nvPicPr>
+                  <pic:blipFill>
+                    <a:blip r:embed="rId71">
+                      <a:extLst>
+                        <a:ext uri="{28A0092B-C50C-407E-A947-70E740481C1C}">
+                          <a14:useLocalDpi xmlns:a14="http://schemas.microsoft.com/office/drawing/2010/main" val="0"/>
+                        </a:ext>
+                        <a:ext uri="{96DAC541-7B7A-43D3-8B79-37D633B846F1}">
+                          <asvg:svgBlip xmlns:asvg="http://schemas.microsoft.com/office/drawing/2016/SVG/main" r:embed="rId68"/>
+                        </a:ext>
+                      </a:extLst>
+                    </a:blip>
+                    <a:stretch>
+                      <a:fillRect/>
+                    </a:stretch>
+                  </pic:blipFill>
+                  <pic:spPr bwMode="auto">
+                    <a:xfrm>
+                      <a:off x="0" y="0"/>
+                      <a:ext cx="4800600" cy="3429000"/>
+                    </a:xfrm>
+                    <a:prstGeom prst="rect">
+                      <a:avLst/>
+                    </a:prstGeom>
+                    <a:noFill/>
+                    <a:ln w="9525">
+                      <a:noFill/>
+                      <a:headEnd/>
+                      <a:tailEnd/>
+                    </a:ln>
+                  </pic:spPr>
+                </pic:pic>
+              </a:graphicData>
+            </a:graphic>
+          </wp:inline>
+        </w:drawing>
       </w:r>
     </w:p>
     <w:p>
@@ -2458,10 +3177,55 @@
         </w:numPr>
       </w:pPr>
       <w:r>
-        <w:rPr>
-          <w:rStyle w:val="VerbatimChar"/>
-        </w:rPr>
-        <w:t xml:space="preserve">{r DiagramaB, fig.width = 7, fig.height = 5, results=asis} # Configurar márgenes del gráfico par(mar = c(4, 4, 2, 6)) # Crear gráfico vacío para el diagrama # Calcular rango para dimensionar el gráfico rango &lt;- 191 - 154 y_min &lt;- 154 - rango * 0.15 y_max &lt;- 191 + rango * 0.15 plot(NA,       # Límites del eje x      xlim = c(0.5, 1.5),       # Límites del eje y calculados      ylim = c(y_min, y_max),      # Sin etiqueta para el eje x      xlab = "",       # Etiqueta para el eje y      ylab = "Estatura (cm)",       # Sin título      main = "",       # No mostrar ejes automáticamente      axes = FALSE) # Dibujar el diagrama de caja # Línea vertical central que va del mínimo al máximo segments(1, 154, 1, 191, lwd = 2) # Rectángulo (caja) desde Q1 hasta Q3 rect(0.8, 166, 1.2, 184, col = "white", border = "black") # Línea horizontal para la mediana dentro de la caja segments(0.8, 178, 1.2, 178, lwd = 2) # Líneas horizontales en los extremos (bigotes) para mínimo y máximo segments(c(0.8, 0.8), c(154, 191),         c(1.2, 1.2), c(154, 191), lwd = 2) # Agregar etiquetas de texto con los valores numéricos text(1.3, 154, paste("Mín =", 154), pos = 4, cex = 0.8) text(1.3, 166, paste("Q1 =", 166), pos = 4, cex = 0.8) text(1.3, 178, paste("Q2 =", 178), pos = 4, cex = 0.8) text(1.3, 184, paste("Q3 =", 184), pos = 4, cex = 0.8) text(1.3, 191, paste("Máx =", 191), pos = 4, cex = 0.8) # Añadir eje vertical y marco al gráfico axis(2, las = 1)  # Eje y con etiquetas horizontales box()  # Marco alrededor del gráfico</w:t>
+        <w:drawing>
+          <wp:inline>
+            <wp:extent cx="4800600" cy="3429000"/>
+            <wp:effectExtent b="0" l="0" r="0" t="0"/>
+            <wp:docPr descr="image" title="" id="73" name="Picture"/>
+            <a:graphic>
+              <a:graphicData uri="http://schemas.openxmlformats.org/drawingml/2006/picture">
+                <pic:pic>
+                  <pic:nvPicPr>
+                    <pic:cNvPr descr="media/supplements1/exercise4/DiagramaB-1.svg" id="74" name="Picture"/>
+                    <pic:cNvPicPr>
+                      <a:picLocks noChangeArrowheads="1" noChangeAspect="1"/>
+                    </pic:cNvPicPr>
+                  </pic:nvPicPr>
+                  <pic:blipFill>
+                    <a:blip r:embed="rId75">
+                      <a:extLst>
+                        <a:ext uri="{28A0092B-C50C-407E-A947-70E740481C1C}">
+                          <a14:useLocalDpi xmlns:a14="http://schemas.microsoft.com/office/drawing/2010/main" val="0"/>
+                        </a:ext>
+                        <a:ext uri="{96DAC541-7B7A-43D3-8B79-37D633B846F1}">
+                          <asvg:svgBlip xmlns:asvg="http://schemas.microsoft.com/office/drawing/2016/SVG/main" r:embed="rId72"/>
+                        </a:ext>
+                      </a:extLst>
+                    </a:blip>
+                    <a:stretch>
+                      <a:fillRect/>
+                    </a:stretch>
+                  </pic:blipFill>
+                  <pic:spPr bwMode="auto">
+                    <a:xfrm>
+                      <a:off x="0" y="0"/>
+                      <a:ext cx="4800600" cy="3429000"/>
+                    </a:xfrm>
+                    <a:prstGeom prst="rect">
+                      <a:avLst/>
+                    </a:prstGeom>
+                    <a:noFill/>
+                    <a:ln w="9525">
+                      <a:noFill/>
+                      <a:headEnd/>
+                      <a:tailEnd/>
+                    </a:ln>
+                  </pic:spPr>
+                </pic:pic>
+              </a:graphicData>
+            </a:graphic>
+          </wp:inline>
+        </w:drawing>
       </w:r>
     </w:p>
     <w:p>
@@ -2472,10 +3236,55 @@
         </w:numPr>
       </w:pPr>
       <w:r>
-        <w:rPr>
-          <w:rStyle w:val="VerbatimChar"/>
-        </w:rPr>
-        <w:t xml:space="preserve">{r DiagramaC, fig.width = 7, fig.height = 5, results=asis} # Configurar márgenes del gráfico par(mar = c(4, 4, 2, 6)) # Crear gráfico vacío para el diagrama # Calcular rango para dimensionar el gráfico rango &lt;- 180 - 150 y_min &lt;- 150 - rango * 0.15 y_max &lt;- 180 + rango * 0.15 plot(NA,       # Límites del eje x      xlim = c(0.5, 1.5),       # Límites del eje y calculados      ylim = c(y_min, y_max),      # Sin etiqueta para el eje x      xlab = "",       # Etiqueta para el eje y      ylab = "Estatura (cm)",       # Sin título      main = "",       # No mostrar ejes automáticamente      axes = FALSE) # Dibujar el diagrama de caja # Línea vertical central que va del mínimo al máximo segments(1, 150, 1, 180, lwd = 2) # Rectángulo (caja) desde Q1 hasta Q3 rect(0.8, 160, 1.2, 175, col = "white", border = "black") # Línea horizontal para la mediana dentro de la caja segments(0.8, 174, 1.2, 174, lwd = 2) # Líneas horizontales en los extremos (bigotes) para mínimo y máximo segments(c(0.8, 0.8), c(150, 180),         c(1.2, 1.2), c(150, 180), lwd = 2) # Agregar etiquetas de texto con los valores numéricos text(1.3, 150, paste("Mín =", 150), pos = 4, cex = 0.8) text(1.3, 160, paste("Q1 =", 160), pos = 4, cex = 0.8) text(1.3, 174, paste("Q2 =", 174), pos = 4, cex = 0.8) text(1.3, 175, paste("Q3 =", 175), pos = 4, cex = 0.8) text(1.3, 180, paste("Máx =", 180), pos = 4, cex = 0.8) # Añadir eje vertical y marco al gráfico axis(2, las = 1)  # Eje y con etiquetas horizontales box()  # Marco alrededor del gráfico</w:t>
+        <w:drawing>
+          <wp:inline>
+            <wp:extent cx="4800600" cy="3429000"/>
+            <wp:effectExtent b="0" l="0" r="0" t="0"/>
+            <wp:docPr descr="image" title="" id="77" name="Picture"/>
+            <a:graphic>
+              <a:graphicData uri="http://schemas.openxmlformats.org/drawingml/2006/picture">
+                <pic:pic>
+                  <pic:nvPicPr>
+                    <pic:cNvPr descr="media/supplements1/exercise4/DiagramaC-1.svg" id="78" name="Picture"/>
+                    <pic:cNvPicPr>
+                      <a:picLocks noChangeArrowheads="1" noChangeAspect="1"/>
+                    </pic:cNvPicPr>
+                  </pic:nvPicPr>
+                  <pic:blipFill>
+                    <a:blip r:embed="rId79">
+                      <a:extLst>
+                        <a:ext uri="{28A0092B-C50C-407E-A947-70E740481C1C}">
+                          <a14:useLocalDpi xmlns:a14="http://schemas.microsoft.com/office/drawing/2010/main" val="0"/>
+                        </a:ext>
+                        <a:ext uri="{96DAC541-7B7A-43D3-8B79-37D633B846F1}">
+                          <asvg:svgBlip xmlns:asvg="http://schemas.microsoft.com/office/drawing/2016/SVG/main" r:embed="rId76"/>
+                        </a:ext>
+                      </a:extLst>
+                    </a:blip>
+                    <a:stretch>
+                      <a:fillRect/>
+                    </a:stretch>
+                  </pic:blipFill>
+                  <pic:spPr bwMode="auto">
+                    <a:xfrm>
+                      <a:off x="0" y="0"/>
+                      <a:ext cx="4800600" cy="3429000"/>
+                    </a:xfrm>
+                    <a:prstGeom prst="rect">
+                      <a:avLst/>
+                    </a:prstGeom>
+                    <a:noFill/>
+                    <a:ln w="9525">
+                      <a:noFill/>
+                      <a:headEnd/>
+                      <a:tailEnd/>
+                    </a:ln>
+                  </pic:spPr>
+                </pic:pic>
+              </a:graphicData>
+            </a:graphic>
+          </wp:inline>
+        </w:drawing>
       </w:r>
     </w:p>
     <w:p>
@@ -2486,10 +3295,55 @@
         </w:numPr>
       </w:pPr>
       <w:r>
-        <w:rPr>
-          <w:rStyle w:val="VerbatimChar"/>
-        </w:rPr>
-        <w:t xml:space="preserve">{r DiagramaD, fig.width = 7, fig.height = 5, results=asis} # Configurar márgenes del gráfico par(mar = c(4, 4, 2, 6)) # Crear gráfico vacío para el diagrama # Calcular rango para dimensionar el gráfico rango &lt;- 227 - 187 y_min &lt;- 187 - rango * 0.15 y_max &lt;- 227 + rango * 0.15 plot(NA,       # Límites del eje x      xlim = c(0.5, 1.5),       # Límites del eje y calculados      ylim = c(y_min, y_max),      # Sin etiqueta para el eje x      xlab = "",       # Etiqueta para el eje y      ylab = "Estatura (cm)",       # Sin título      main = "",       # No mostrar ejes automáticamente      axes = FALSE) # Dibujar el diagrama de caja # Línea vertical central que va del mínimo al máximo segments(1, 187, 1, 227, lwd = 2) # Rectángulo (caja) desde Q1 hasta Q3 rect(0.8, 191, 1.2, 209, col = "white", border = "black") # Línea horizontal para la mediana dentro de la caja segments(0.8, 199, 1.2, 199, lwd = 2) # Líneas horizontales en los extremos (bigotes) para mínimo y máximo segments(c(0.8, 0.8), c(187, 227),         c(1.2, 1.2), c(187, 227), lwd = 2) # Agregar etiquetas de texto con los valores numéricos text(1.3, 187, paste("Mín =", 187), pos = 4, cex = 0.8) text(1.3, 191, paste("Q1 =", 191), pos = 4, cex = 0.8) text(1.3, 199, paste("Q2 =", 199), pos = 4, cex = 0.8) text(1.3, 209, paste("Q3 =", 209), pos = 4, cex = 0.8) text(1.3, 227, paste("Máx =", 227), pos = 4, cex = 0.8) # Añadir eje vertical y marco al gráfico axis(2, las = 1)  # Eje y con etiquetas horizontales box()  # Marco alrededor del gráfico</w:t>
+        <w:drawing>
+          <wp:inline>
+            <wp:extent cx="4800600" cy="3429000"/>
+            <wp:effectExtent b="0" l="0" r="0" t="0"/>
+            <wp:docPr descr="image" title="" id="81" name="Picture"/>
+            <a:graphic>
+              <a:graphicData uri="http://schemas.openxmlformats.org/drawingml/2006/picture">
+                <pic:pic>
+                  <pic:nvPicPr>
+                    <pic:cNvPr descr="media/supplements1/exercise4/DiagramaA-1.svg" id="82" name="Picture"/>
+                    <pic:cNvPicPr>
+                      <a:picLocks noChangeArrowheads="1" noChangeAspect="1"/>
+                    </pic:cNvPicPr>
+                  </pic:nvPicPr>
+                  <pic:blipFill>
+                    <a:blip r:embed="rId83">
+                      <a:extLst>
+                        <a:ext uri="{28A0092B-C50C-407E-A947-70E740481C1C}">
+                          <a14:useLocalDpi xmlns:a14="http://schemas.microsoft.com/office/drawing/2010/main" val="0"/>
+                        </a:ext>
+                        <a:ext uri="{96DAC541-7B7A-43D3-8B79-37D633B846F1}">
+                          <asvg:svgBlip xmlns:asvg="http://schemas.microsoft.com/office/drawing/2016/SVG/main" r:embed="rId80"/>
+                        </a:ext>
+                      </a:extLst>
+                    </a:blip>
+                    <a:stretch>
+                      <a:fillRect/>
+                    </a:stretch>
+                  </pic:blipFill>
+                  <pic:spPr bwMode="auto">
+                    <a:xfrm>
+                      <a:off x="0" y="0"/>
+                      <a:ext cx="4800600" cy="3429000"/>
+                    </a:xfrm>
+                    <a:prstGeom prst="rect">
+                      <a:avLst/>
+                    </a:prstGeom>
+                    <a:noFill/>
+                    <a:ln w="9525">
+                      <a:noFill/>
+                      <a:headEnd/>
+                      <a:tailEnd/>
+                    </a:ln>
+                  </pic:spPr>
+                </pic:pic>
+              </a:graphicData>
+            </a:graphic>
+          </wp:inline>
+        </w:drawing>
       </w:r>
     </w:p>
     <w:p>
@@ -2521,7 +3375,7 @@
         </w:numPr>
       </w:pPr>
       <w:r>
-        <w:t xml:space="preserve">Mínimo: 154 cm</w:t>
+        <w:t xml:space="preserve">Mínimo: 158.6 cm</w:t>
       </w:r>
     </w:p>
     <w:p>
@@ -2532,7 +3386,7 @@
         </w:numPr>
       </w:pPr>
       <w:r>
-        <w:t xml:space="preserve">Q1: 166 cm</w:t>
+        <w:t xml:space="preserve">Q1 (primer cuartil): 167.8 cm</w:t>
       </w:r>
     </w:p>
     <w:p>
@@ -2543,7 +3397,7 @@
         </w:numPr>
       </w:pPr>
       <w:r>
-        <w:t xml:space="preserve">Q2 = Mediana: 178 cm</w:t>
+        <w:t xml:space="preserve">Q2 (mediana): 173.4 cm</w:t>
       </w:r>
     </w:p>
     <w:p>
@@ -2554,7 +3408,7 @@
         </w:numPr>
       </w:pPr>
       <w:r>
-        <w:t xml:space="preserve">Q3: 184 cm</w:t>
+        <w:t xml:space="preserve">Q3 (tercer cuartil): 177.8 cm</w:t>
       </w:r>
     </w:p>
     <w:p>
@@ -2565,18 +3419,18 @@
         </w:numPr>
       </w:pPr>
       <w:r>
-        <w:t xml:space="preserve">Máximo: 191 cm</w:t>
-      </w:r>
-    </w:p>
-    <w:p>
-      <w:pPr>
-        <w:numPr>
-          <w:ilvl w:val="0"/>
-          <w:numId w:val="1000"/>
-        </w:numPr>
-      </w:pPr>
-      <w:r>
-        <w:t xml:space="preserve">La opción correcta es aquella cuyo diagrama muestra exactamente estos valores. Cada uno de los diagramas incorrectos presenta alguna inconsistencia con estos valores estadísticos.</w:t>
+        <w:t xml:space="preserve">Máximo: 182 cm</w:t>
+      </w:r>
+    </w:p>
+    <w:p>
+      <w:pPr>
+        <w:numPr>
+          <w:ilvl w:val="0"/>
+          <w:numId w:val="1000"/>
+        </w:numPr>
+      </w:pPr>
+      <w:r>
+        <w:t xml:space="preserve">La opción correcta es aquella cuyo diagrama muestra exactamente estos valores.</w:t>
       </w:r>
     </w:p>
     <w:p>
@@ -2587,7 +3441,7 @@
         </w:numPr>
       </w:pPr>
       <w:r>
-        <w:t xml:space="preserve">Incorrecto. Este diagrama no representa correctamente los valores estadísticos.</w:t>
+        <w:t xml:space="preserve">Correcto. Este diagrama representa fielmente todos los valores estadísticos.</w:t>
       </w:r>
     </w:p>
     <w:p>
@@ -2598,7 +3452,7 @@
         </w:numPr>
       </w:pPr>
       <w:r>
-        <w:t xml:space="preserve">Correcto. Este diagrama representa fielmente todos los valores estadísticos calculados a partir de los datos.</w:t>
+        <w:t xml:space="preserve">Incorrecto. Los cuartiles Q1 y Q3 están invertidos.</w:t>
       </w:r>
     </w:p>
     <w:p>
@@ -2609,7 +3463,7 @@
         </w:numPr>
       </w:pPr>
       <w:r>
-        <w:t xml:space="preserve">Incorrecto. Este diagrama no representa correctamente los valores estadísticos.</w:t>
+        <w:t xml:space="preserve">Incorrecto. Los valores están multiplicados por 10.</w:t>
       </w:r>
     </w:p>
     <w:p>
@@ -2620,7 +3474,7 @@
         </w:numPr>
       </w:pPr>
       <w:r>
-        <w:t xml:space="preserve">Incorrecto. Este diagrama no representa correctamente los valores estadísticos.</w:t>
+        <w:t xml:space="preserve">Incorrecto. La mediana está mal calculada.</w:t>
       </w:r>
     </w:p>
     <w:p>
@@ -2646,6 +3500,144 @@
     </w:p>
     <w:p>
       <w:pPr>
+        <w:pStyle w:val="SourceCode"/>
+        <w:numPr>
+          <w:ilvl w:val="0"/>
+          <w:numId w:val="1000"/>
+        </w:numPr>
+      </w:pPr>
+      <w:r>
+        <w:rPr>
+          <w:rStyle w:val="VerbatimChar"/>
+        </w:rPr>
+        <w:t xml:space="preserve"># Crear tabla con los datos</w:t>
+      </w:r>
+      <w:r>
+        <w:br/>
+      </w:r>
+      <w:r>
+        <w:rPr>
+          <w:rStyle w:val="VerbatimChar"/>
+        </w:rPr>
+        <w:t xml:space="preserve">datos_tabla &lt;- data.frame(</w:t>
+      </w:r>
+      <w:r>
+        <w:br/>
+      </w:r>
+      <w:r>
+        <w:rPr>
+          <w:rStyle w:val="VerbatimChar"/>
+        </w:rPr>
+        <w:t xml:space="preserve">    "Estudiante" = 1:length(stats$datos_desordenados),</w:t>
+      </w:r>
+      <w:r>
+        <w:br/>
+      </w:r>
+      <w:r>
+        <w:rPr>
+          <w:rStyle w:val="VerbatimChar"/>
+        </w:rPr>
+        <w:t xml:space="preserve">    "Estatura (cm)" = stats$datos_desordenados</w:t>
+      </w:r>
+      <w:r>
+        <w:br/>
+      </w:r>
+      <w:r>
+        <w:rPr>
+          <w:rStyle w:val="VerbatimChar"/>
+        </w:rPr>
+        <w:t xml:space="preserve">)</w:t>
+      </w:r>
+      <w:r>
+        <w:br/>
+      </w:r>
+      <w:r>
+        <w:br/>
+      </w:r>
+      <w:r>
+        <w:rPr>
+          <w:rStyle w:val="VerbatimChar"/>
+        </w:rPr>
+        <w:t xml:space="preserve"># Configurar tabla usando xtable</w:t>
+      </w:r>
+      <w:r>
+        <w:br/>
+      </w:r>
+      <w:r>
+        <w:rPr>
+          <w:rStyle w:val="VerbatimChar"/>
+        </w:rPr>
+        <w:t xml:space="preserve">tabla_xtable &lt;- xtable(datos_tabla,</w:t>
+      </w:r>
+      <w:r>
+        <w:br/>
+      </w:r>
+      <w:r>
+        <w:rPr>
+          <w:rStyle w:val="VerbatimChar"/>
+        </w:rPr>
+        <w:t xml:space="preserve">                       align = c("l", "c", "c"),</w:t>
+      </w:r>
+      <w:r>
+        <w:br/>
+      </w:r>
+      <w:r>
+        <w:rPr>
+          <w:rStyle w:val="VerbatimChar"/>
+        </w:rPr>
+        <w:t xml:space="preserve">                       digits = c(0, 0, 1))  # Permitir un decimal en la estatura</w:t>
+      </w:r>
+      <w:r>
+        <w:br/>
+      </w:r>
+      <w:r>
+        <w:br/>
+      </w:r>
+      <w:r>
+        <w:rPr>
+          <w:rStyle w:val="VerbatimChar"/>
+        </w:rPr>
+        <w:t xml:space="preserve"># Imprimir tabla en formato HTML</w:t>
+      </w:r>
+      <w:r>
+        <w:br/>
+      </w:r>
+      <w:r>
+        <w:rPr>
+          <w:rStyle w:val="VerbatimChar"/>
+        </w:rPr>
+        <w:t xml:space="preserve">print(tabla_xtable, </w:t>
+      </w:r>
+      <w:r>
+        <w:br/>
+      </w:r>
+      <w:r>
+        <w:rPr>
+          <w:rStyle w:val="VerbatimChar"/>
+        </w:rPr>
+        <w:t xml:space="preserve">      type = "html",</w:t>
+      </w:r>
+      <w:r>
+        <w:br/>
+      </w:r>
+      <w:r>
+        <w:rPr>
+          <w:rStyle w:val="VerbatimChar"/>
+        </w:rPr>
+        <w:t xml:space="preserve">      include.rownames = FALSE,</w:t>
+      </w:r>
+      <w:r>
+        <w:br/>
+      </w:r>
+      <w:r>
+        <w:rPr>
+          <w:rStyle w:val="VerbatimChar"/>
+        </w:rPr>
+        <w:t xml:space="preserve">      html.table.attributes = 'border="1" cellpadding="5" cellspacing="0"')</w:t>
+      </w:r>
+    </w:p>
+    <w:p>
+      <w:pPr>
         <w:numPr>
           <w:ilvl w:val="0"/>
           <w:numId w:val="1000"/>
@@ -2685,7 +3677,7 @@
         </w:numPr>
       </w:pPr>
       <w:r>
-        <w:t xml:space="preserve">191</w:t>
+        <w:t xml:space="preserve">158.0</w:t>
       </w:r>
     </w:p>
     <w:p>
@@ -2707,7 +3699,7 @@
         </w:numPr>
       </w:pPr>
       <w:r>
-        <w:t xml:space="preserve">189</w:t>
+        <w:t xml:space="preserve">170.8</w:t>
       </w:r>
     </w:p>
     <w:p>
@@ -2729,7 +3721,7 @@
         </w:numPr>
       </w:pPr>
       <w:r>
-        <w:t xml:space="preserve">188</w:t>
+        <w:t xml:space="preserve">174.9</w:t>
       </w:r>
     </w:p>
     <w:p>
@@ -2751,7 +3743,7 @@
         </w:numPr>
       </w:pPr>
       <w:r>
-        <w:t xml:space="preserve">178</w:t>
+        <w:t xml:space="preserve">171.4</w:t>
       </w:r>
     </w:p>
     <w:p>
@@ -2773,7 +3765,7 @@
         </w:numPr>
       </w:pPr>
       <w:r>
-        <w:t xml:space="preserve">154</w:t>
+        <w:t xml:space="preserve">160.5</w:t>
       </w:r>
     </w:p>
     <w:p>
@@ -2795,7 +3787,7 @@
         </w:numPr>
       </w:pPr>
       <w:r>
-        <w:t xml:space="preserve">166</w:t>
+        <w:t xml:space="preserve">170.5</w:t>
       </w:r>
     </w:p>
     <w:p>
@@ -2817,7 +3809,7 @@
         </w:numPr>
       </w:pPr>
       <w:r>
-        <w:t xml:space="preserve">177</w:t>
+        <w:t xml:space="preserve">183.4</w:t>
       </w:r>
     </w:p>
     <w:p>
@@ -2839,7 +3831,7 @@
         </w:numPr>
       </w:pPr>
       <w:r>
-        <w:t xml:space="preserve">157</w:t>
+        <w:t xml:space="preserve">170.5</w:t>
       </w:r>
     </w:p>
     <w:p>
@@ -2861,7 +3853,7 @@
         </w:numPr>
       </w:pPr>
       <w:r>
-        <w:t xml:space="preserve">184</w:t>
+        <w:t xml:space="preserve">155.2</w:t>
       </w:r>
     </w:p>
     <w:p>
@@ -2883,7 +3875,7 @@
         </w:numPr>
       </w:pPr>
       <w:r>
-        <w:t xml:space="preserve">175</w:t>
+        <w:t xml:space="preserve">175.9</w:t>
       </w:r>
     </w:p>
     <w:p>
@@ -2905,51 +3897,7 @@
         </w:numPr>
       </w:pPr>
       <w:r>
-        <w:t xml:space="preserve">181</w:t>
-      </w:r>
-    </w:p>
-    <w:p>
-      <w:pPr>
-        <w:numPr>
-          <w:ilvl w:val="0"/>
-          <w:numId w:val="1000"/>
-        </w:numPr>
-      </w:pPr>
-      <w:r>
-        <w:t xml:space="preserve">12</w:t>
-      </w:r>
-    </w:p>
-    <w:p>
-      <w:pPr>
-        <w:numPr>
-          <w:ilvl w:val="0"/>
-          <w:numId w:val="1000"/>
-        </w:numPr>
-      </w:pPr>
-      <w:r>
-        <w:t xml:space="preserve">164</w:t>
-      </w:r>
-    </w:p>
-    <w:p>
-      <w:pPr>
-        <w:numPr>
-          <w:ilvl w:val="0"/>
-          <w:numId w:val="1000"/>
-        </w:numPr>
-      </w:pPr>
-      <w:r>
-        <w:t xml:space="preserve">13</w:t>
-      </w:r>
-    </w:p>
-    <w:p>
-      <w:pPr>
-        <w:numPr>
-          <w:ilvl w:val="0"/>
-          <w:numId w:val="1000"/>
-        </w:numPr>
-      </w:pPr>
-      <w:r>
-        <w:t xml:space="preserve">180</w:t>
+        <w:t xml:space="preserve">147.1</w:t>
       </w:r>
     </w:p>
     <w:p>
@@ -2971,10 +3919,55 @@
         </w:numPr>
       </w:pPr>
       <w:r>
-        <w:rPr>
-          <w:rStyle w:val="VerbatimChar"/>
-        </w:rPr>
-        <w:t xml:space="preserve">{r DiagramaA, fig.width = 7, fig.height = 5, results=asis} # Configurar márgenes del gráfico par(mar = c(4, 4, 2, 6)) # Crear gráfico vacío para el diagrama # Calcular rango para dimensionar el gráfico rango &lt;- 177 - 155 y_min &lt;- 155 - rango * 0.15 y_max &lt;- 177 + rango * 0.15 plot(NA,       # Límites del eje x      xlim = c(0.5, 1.5),       # Límites del eje y calculados      ylim = c(y_min, y_max),      # Sin etiqueta para el eje x      xlab = "",       # Etiqueta para el eje y      ylab = "Estatura (cm)",       # Sin título      main = "",       # No mostrar ejes automáticamente      axes = FALSE) # Dibujar el diagrama de caja # Línea vertical central que va del mínimo al máximo segments(1, 155, 1, 177, lwd = 2) # Rectángulo (caja) desde Q1 hasta Q3 rect(0.8, 159, 1.2, 168, col = "white", border = "black") # Línea horizontal para la mediana dentro de la caja segments(0.8, 160, 1.2, 160, lwd = 2) # Líneas horizontales en los extremos (bigotes) para mínimo y máximo segments(c(0.8, 0.8), c(155, 177),         c(1.2, 1.2), c(155, 177), lwd = 2) # Agregar etiquetas de texto con los valores numéricos text(1.3, 155, paste("Mín =", 155), pos = 4, cex = 0.8) text(1.3, 159, paste("Q1 =", 159), pos = 4, cex = 0.8) text(1.3, 160, paste("Q2 =", 160), pos = 4, cex = 0.8) text(1.3, 168, paste("Q3 =", 168), pos = 4, cex = 0.8) text(1.3, 177, paste("Máx =", 177), pos = 4, cex = 0.8) # Añadir eje vertical y marco al gráfico axis(2, las = 1)  # Eje y con etiquetas horizontales box()  # Marco alrededor del gráfico</w:t>
+        <w:drawing>
+          <wp:inline>
+            <wp:extent cx="4800600" cy="3429000"/>
+            <wp:effectExtent b="0" l="0" r="0" t="0"/>
+            <wp:docPr descr="image" title="" id="85" name="Picture"/>
+            <a:graphic>
+              <a:graphicData uri="http://schemas.openxmlformats.org/drawingml/2006/picture">
+                <pic:pic>
+                  <pic:nvPicPr>
+                    <pic:cNvPr descr="media/supplements1/exercise5/DiagramaD-1.svg" id="86" name="Picture"/>
+                    <pic:cNvPicPr>
+                      <a:picLocks noChangeArrowheads="1" noChangeAspect="1"/>
+                    </pic:cNvPicPr>
+                  </pic:nvPicPr>
+                  <pic:blipFill>
+                    <a:blip r:embed="rId87">
+                      <a:extLst>
+                        <a:ext uri="{28A0092B-C50C-407E-A947-70E740481C1C}">
+                          <a14:useLocalDpi xmlns:a14="http://schemas.microsoft.com/office/drawing/2010/main" val="0"/>
+                        </a:ext>
+                        <a:ext uri="{96DAC541-7B7A-43D3-8B79-37D633B846F1}">
+                          <asvg:svgBlip xmlns:asvg="http://schemas.microsoft.com/office/drawing/2016/SVG/main" r:embed="rId84"/>
+                        </a:ext>
+                      </a:extLst>
+                    </a:blip>
+                    <a:stretch>
+                      <a:fillRect/>
+                    </a:stretch>
+                  </pic:blipFill>
+                  <pic:spPr bwMode="auto">
+                    <a:xfrm>
+                      <a:off x="0" y="0"/>
+                      <a:ext cx="4800600" cy="3429000"/>
+                    </a:xfrm>
+                    <a:prstGeom prst="rect">
+                      <a:avLst/>
+                    </a:prstGeom>
+                    <a:noFill/>
+                    <a:ln w="9525">
+                      <a:noFill/>
+                      <a:headEnd/>
+                      <a:tailEnd/>
+                    </a:ln>
+                  </pic:spPr>
+                </pic:pic>
+              </a:graphicData>
+            </a:graphic>
+          </wp:inline>
+        </w:drawing>
       </w:r>
     </w:p>
     <w:p>
@@ -2985,10 +3978,55 @@
         </w:numPr>
       </w:pPr>
       <w:r>
-        <w:rPr>
-          <w:rStyle w:val="VerbatimChar"/>
-        </w:rPr>
-        <w:t xml:space="preserve">{r DiagramaB, fig.width = 7, fig.height = 5, results=asis} # Configurar márgenes del gráfico par(mar = c(4, 4, 2, 6)) # Crear gráfico vacío para el diagrama # Calcular rango para dimensionar el gráfico rango &lt;- 191 - 154 y_min &lt;- 154 - rango * 0.15 y_max &lt;- 191 + rango * 0.15 plot(NA,       # Límites del eje x      xlim = c(0.5, 1.5),       # Límites del eje y calculados      ylim = c(y_min, y_max),      # Sin etiqueta para el eje x      xlab = "",       # Etiqueta para el eje y      ylab = "Estatura (cm)",       # Sin título      main = "",       # No mostrar ejes automáticamente      axes = FALSE) # Dibujar el diagrama de caja # Línea vertical central que va del mínimo al máximo segments(1, 154, 1, 191, lwd = 2) # Rectángulo (caja) desde Q1 hasta Q3 rect(0.8, 166, 1.2, 184, col = "white", border = "black") # Línea horizontal para la mediana dentro de la caja segments(0.8, 178, 1.2, 178, lwd = 2) # Líneas horizontales en los extremos (bigotes) para mínimo y máximo segments(c(0.8, 0.8), c(154, 191),         c(1.2, 1.2), c(154, 191), lwd = 2) # Agregar etiquetas de texto con los valores numéricos text(1.3, 154, paste("Mín =", 154), pos = 4, cex = 0.8) text(1.3, 166, paste("Q1 =", 166), pos = 4, cex = 0.8) text(1.3, 178, paste("Q2 =", 178), pos = 4, cex = 0.8) text(1.3, 184, paste("Q3 =", 184), pos = 4, cex = 0.8) text(1.3, 191, paste("Máx =", 191), pos = 4, cex = 0.8) # Añadir eje vertical y marco al gráfico axis(2, las = 1)  # Eje y con etiquetas horizontales box()  # Marco alrededor del gráfico</w:t>
+        <w:drawing>
+          <wp:inline>
+            <wp:extent cx="4800600" cy="3429000"/>
+            <wp:effectExtent b="0" l="0" r="0" t="0"/>
+            <wp:docPr descr="image" title="" id="89" name="Picture"/>
+            <a:graphic>
+              <a:graphicData uri="http://schemas.openxmlformats.org/drawingml/2006/picture">
+                <pic:pic>
+                  <pic:nvPicPr>
+                    <pic:cNvPr descr="media/supplements1/exercise5/DiagramaC-1.svg" id="90" name="Picture"/>
+                    <pic:cNvPicPr>
+                      <a:picLocks noChangeArrowheads="1" noChangeAspect="1"/>
+                    </pic:cNvPicPr>
+                  </pic:nvPicPr>
+                  <pic:blipFill>
+                    <a:blip r:embed="rId91">
+                      <a:extLst>
+                        <a:ext uri="{28A0092B-C50C-407E-A947-70E740481C1C}">
+                          <a14:useLocalDpi xmlns:a14="http://schemas.microsoft.com/office/drawing/2010/main" val="0"/>
+                        </a:ext>
+                        <a:ext uri="{96DAC541-7B7A-43D3-8B79-37D633B846F1}">
+                          <asvg:svgBlip xmlns:asvg="http://schemas.microsoft.com/office/drawing/2016/SVG/main" r:embed="rId88"/>
+                        </a:ext>
+                      </a:extLst>
+                    </a:blip>
+                    <a:stretch>
+                      <a:fillRect/>
+                    </a:stretch>
+                  </pic:blipFill>
+                  <pic:spPr bwMode="auto">
+                    <a:xfrm>
+                      <a:off x="0" y="0"/>
+                      <a:ext cx="4800600" cy="3429000"/>
+                    </a:xfrm>
+                    <a:prstGeom prst="rect">
+                      <a:avLst/>
+                    </a:prstGeom>
+                    <a:noFill/>
+                    <a:ln w="9525">
+                      <a:noFill/>
+                      <a:headEnd/>
+                      <a:tailEnd/>
+                    </a:ln>
+                  </pic:spPr>
+                </pic:pic>
+              </a:graphicData>
+            </a:graphic>
+          </wp:inline>
+        </w:drawing>
       </w:r>
     </w:p>
     <w:p>
@@ -2999,10 +4037,55 @@
         </w:numPr>
       </w:pPr>
       <w:r>
-        <w:rPr>
-          <w:rStyle w:val="VerbatimChar"/>
-        </w:rPr>
-        <w:t xml:space="preserve">{r DiagramaC, fig.width = 7, fig.height = 5, results=asis} # Configurar márgenes del gráfico par(mar = c(4, 4, 2, 6)) # Crear gráfico vacío para el diagrama # Calcular rango para dimensionar el gráfico rango &lt;- 180 - 150 y_min &lt;- 150 - rango * 0.15 y_max &lt;- 180 + rango * 0.15 plot(NA,       # Límites del eje x      xlim = c(0.5, 1.5),       # Límites del eje y calculados      ylim = c(y_min, y_max),      # Sin etiqueta para el eje x      xlab = "",       # Etiqueta para el eje y      ylab = "Estatura (cm)",       # Sin título      main = "",       # No mostrar ejes automáticamente      axes = FALSE) # Dibujar el diagrama de caja # Línea vertical central que va del mínimo al máximo segments(1, 150, 1, 180, lwd = 2) # Rectángulo (caja) desde Q1 hasta Q3 rect(0.8, 160, 1.2, 175, col = "white", border = "black") # Línea horizontal para la mediana dentro de la caja segments(0.8, 174, 1.2, 174, lwd = 2) # Líneas horizontales en los extremos (bigotes) para mínimo y máximo segments(c(0.8, 0.8), c(150, 180),         c(1.2, 1.2), c(150, 180), lwd = 2) # Agregar etiquetas de texto con los valores numéricos text(1.3, 150, paste("Mín =", 150), pos = 4, cex = 0.8) text(1.3, 160, paste("Q1 =", 160), pos = 4, cex = 0.8) text(1.3, 174, paste("Q2 =", 174), pos = 4, cex = 0.8) text(1.3, 175, paste("Q3 =", 175), pos = 4, cex = 0.8) text(1.3, 180, paste("Máx =", 180), pos = 4, cex = 0.8) # Añadir eje vertical y marco al gráfico axis(2, las = 1)  # Eje y con etiquetas horizontales box()  # Marco alrededor del gráfico</w:t>
+        <w:drawing>
+          <wp:inline>
+            <wp:extent cx="4800600" cy="3429000"/>
+            <wp:effectExtent b="0" l="0" r="0" t="0"/>
+            <wp:docPr descr="image" title="" id="93" name="Picture"/>
+            <a:graphic>
+              <a:graphicData uri="http://schemas.openxmlformats.org/drawingml/2006/picture">
+                <pic:pic>
+                  <pic:nvPicPr>
+                    <pic:cNvPr descr="media/supplements1/exercise5/DiagramaB-1.svg" id="94" name="Picture"/>
+                    <pic:cNvPicPr>
+                      <a:picLocks noChangeArrowheads="1" noChangeAspect="1"/>
+                    </pic:cNvPicPr>
+                  </pic:nvPicPr>
+                  <pic:blipFill>
+                    <a:blip r:embed="rId95">
+                      <a:extLst>
+                        <a:ext uri="{28A0092B-C50C-407E-A947-70E740481C1C}">
+                          <a14:useLocalDpi xmlns:a14="http://schemas.microsoft.com/office/drawing/2010/main" val="0"/>
+                        </a:ext>
+                        <a:ext uri="{96DAC541-7B7A-43D3-8B79-37D633B846F1}">
+                          <asvg:svgBlip xmlns:asvg="http://schemas.microsoft.com/office/drawing/2016/SVG/main" r:embed="rId92"/>
+                        </a:ext>
+                      </a:extLst>
+                    </a:blip>
+                    <a:stretch>
+                      <a:fillRect/>
+                    </a:stretch>
+                  </pic:blipFill>
+                  <pic:spPr bwMode="auto">
+                    <a:xfrm>
+                      <a:off x="0" y="0"/>
+                      <a:ext cx="4800600" cy="3429000"/>
+                    </a:xfrm>
+                    <a:prstGeom prst="rect">
+                      <a:avLst/>
+                    </a:prstGeom>
+                    <a:noFill/>
+                    <a:ln w="9525">
+                      <a:noFill/>
+                      <a:headEnd/>
+                      <a:tailEnd/>
+                    </a:ln>
+                  </pic:spPr>
+                </pic:pic>
+              </a:graphicData>
+            </a:graphic>
+          </wp:inline>
+        </w:drawing>
       </w:r>
     </w:p>
     <w:p>
@@ -3013,10 +4096,55 @@
         </w:numPr>
       </w:pPr>
       <w:r>
-        <w:rPr>
-          <w:rStyle w:val="VerbatimChar"/>
-        </w:rPr>
-        <w:t xml:space="preserve">{r DiagramaD, fig.width = 7, fig.height = 5, results=asis} # Configurar márgenes del gráfico par(mar = c(4, 4, 2, 6)) # Crear gráfico vacío para el diagrama # Calcular rango para dimensionar el gráfico rango &lt;- 227 - 187 y_min &lt;- 187 - rango * 0.15 y_max &lt;- 227 + rango * 0.15 plot(NA,       # Límites del eje x      xlim = c(0.5, 1.5),       # Límites del eje y calculados      ylim = c(y_min, y_max),      # Sin etiqueta para el eje x      xlab = "",       # Etiqueta para el eje y      ylab = "Estatura (cm)",       # Sin título      main = "",       # No mostrar ejes automáticamente      axes = FALSE) # Dibujar el diagrama de caja # Línea vertical central que va del mínimo al máximo segments(1, 187, 1, 227, lwd = 2) # Rectángulo (caja) desde Q1 hasta Q3 rect(0.8, 191, 1.2, 209, col = "white", border = "black") # Línea horizontal para la mediana dentro de la caja segments(0.8, 199, 1.2, 199, lwd = 2) # Líneas horizontales en los extremos (bigotes) para mínimo y máximo segments(c(0.8, 0.8), c(187, 227),         c(1.2, 1.2), c(187, 227), lwd = 2) # Agregar etiquetas de texto con los valores numéricos text(1.3, 187, paste("Mín =", 187), pos = 4, cex = 0.8) text(1.3, 191, paste("Q1 =", 191), pos = 4, cex = 0.8) text(1.3, 199, paste("Q2 =", 199), pos = 4, cex = 0.8) text(1.3, 209, paste("Q3 =", 209), pos = 4, cex = 0.8) text(1.3, 227, paste("Máx =", 227), pos = 4, cex = 0.8) # Añadir eje vertical y marco al gráfico axis(2, las = 1)  # Eje y con etiquetas horizontales box()  # Marco alrededor del gráfico</w:t>
+        <w:drawing>
+          <wp:inline>
+            <wp:extent cx="4800600" cy="3429000"/>
+            <wp:effectExtent b="0" l="0" r="0" t="0"/>
+            <wp:docPr descr="image" title="" id="97" name="Picture"/>
+            <a:graphic>
+              <a:graphicData uri="http://schemas.openxmlformats.org/drawingml/2006/picture">
+                <pic:pic>
+                  <pic:nvPicPr>
+                    <pic:cNvPr descr="media/supplements1/exercise5/DiagramaA-1.svg" id="98" name="Picture"/>
+                    <pic:cNvPicPr>
+                      <a:picLocks noChangeArrowheads="1" noChangeAspect="1"/>
+                    </pic:cNvPicPr>
+                  </pic:nvPicPr>
+                  <pic:blipFill>
+                    <a:blip r:embed="rId99">
+                      <a:extLst>
+                        <a:ext uri="{28A0092B-C50C-407E-A947-70E740481C1C}">
+                          <a14:useLocalDpi xmlns:a14="http://schemas.microsoft.com/office/drawing/2010/main" val="0"/>
+                        </a:ext>
+                        <a:ext uri="{96DAC541-7B7A-43D3-8B79-37D633B846F1}">
+                          <asvg:svgBlip xmlns:asvg="http://schemas.microsoft.com/office/drawing/2016/SVG/main" r:embed="rId96"/>
+                        </a:ext>
+                      </a:extLst>
+                    </a:blip>
+                    <a:stretch>
+                      <a:fillRect/>
+                    </a:stretch>
+                  </pic:blipFill>
+                  <pic:spPr bwMode="auto">
+                    <a:xfrm>
+                      <a:off x="0" y="0"/>
+                      <a:ext cx="4800600" cy="3429000"/>
+                    </a:xfrm>
+                    <a:prstGeom prst="rect">
+                      <a:avLst/>
+                    </a:prstGeom>
+                    <a:noFill/>
+                    <a:ln w="9525">
+                      <a:noFill/>
+                      <a:headEnd/>
+                      <a:tailEnd/>
+                    </a:ln>
+                  </pic:spPr>
+                </pic:pic>
+              </a:graphicData>
+            </a:graphic>
+          </wp:inline>
+        </w:drawing>
       </w:r>
     </w:p>
     <w:p>
@@ -3048,7 +4176,7 @@
         </w:numPr>
       </w:pPr>
       <w:r>
-        <w:t xml:space="preserve">Mínimo: 154 cm</w:t>
+        <w:t xml:space="preserve">Mínimo: 147.1 cm</w:t>
       </w:r>
     </w:p>
     <w:p>
@@ -3059,7 +4187,7 @@
         </w:numPr>
       </w:pPr>
       <w:r>
-        <w:t xml:space="preserve">Q1: 166 cm</w:t>
+        <w:t xml:space="preserve">Q1 (primer cuartil): 159.2 cm</w:t>
       </w:r>
     </w:p>
     <w:p>
@@ -3070,7 +4198,7 @@
         </w:numPr>
       </w:pPr>
       <w:r>
-        <w:t xml:space="preserve">Q2 = Mediana: 178 cm</w:t>
+        <w:t xml:space="preserve">Q2 (mediana): 170.5 cm</w:t>
       </w:r>
     </w:p>
     <w:p>
@@ -3081,7 +4209,7 @@
         </w:numPr>
       </w:pPr>
       <w:r>
-        <w:t xml:space="preserve">Q3: 184 cm</w:t>
+        <w:t xml:space="preserve">Q3 (tercer cuartil): 173.2 cm</w:t>
       </w:r>
     </w:p>
     <w:p>
@@ -3092,18 +4220,18 @@
         </w:numPr>
       </w:pPr>
       <w:r>
-        <w:t xml:space="preserve">Máximo: 191 cm</w:t>
-      </w:r>
-    </w:p>
-    <w:p>
-      <w:pPr>
-        <w:numPr>
-          <w:ilvl w:val="0"/>
-          <w:numId w:val="1000"/>
-        </w:numPr>
-      </w:pPr>
-      <w:r>
-        <w:t xml:space="preserve">La opción correcta es aquella cuyo diagrama muestra exactamente estos valores. Cada uno de los diagramas incorrectos presenta alguna inconsistencia con estos valores estadísticos.</w:t>
+        <w:t xml:space="preserve">Máximo: 183.4 cm</w:t>
+      </w:r>
+    </w:p>
+    <w:p>
+      <w:pPr>
+        <w:numPr>
+          <w:ilvl w:val="0"/>
+          <w:numId w:val="1000"/>
+        </w:numPr>
+      </w:pPr>
+      <w:r>
+        <w:t xml:space="preserve">La opción correcta es aquella cuyo diagrama muestra exactamente estos valores.</w:t>
       </w:r>
     </w:p>
     <w:p>
@@ -3114,7 +4242,7 @@
         </w:numPr>
       </w:pPr>
       <w:r>
-        <w:t xml:space="preserve">Incorrecto. Este diagrama no representa correctamente los valores estadísticos.</w:t>
+        <w:t xml:space="preserve">Correcto. Este diagrama representa fielmente todos los valores estadísticos.</w:t>
       </w:r>
     </w:p>
     <w:p>
@@ -3125,7 +4253,7 @@
         </w:numPr>
       </w:pPr>
       <w:r>
-        <w:t xml:space="preserve">Correcto. Este diagrama representa fielmente todos los valores estadísticos calculados a partir de los datos.</w:t>
+        <w:t xml:space="preserve">Incorrecto. Los valores están multiplicados por 10.</w:t>
       </w:r>
     </w:p>
     <w:p>
@@ -3136,7 +4264,7 @@
         </w:numPr>
       </w:pPr>
       <w:r>
-        <w:t xml:space="preserve">Incorrecto. Este diagrama no representa correctamente los valores estadísticos.</w:t>
+        <w:t xml:space="preserve">Incorrecto. Los cuartiles Q1 y Q3 están invertidos.</w:t>
       </w:r>
     </w:p>
     <w:p>
@@ -3147,10 +4275,10 @@
         </w:numPr>
       </w:pPr>
       <w:r>
-        <w:t xml:space="preserve">Incorrecto. Este diagrama no representa correctamente los valores estadísticos.</w:t>
-      </w:r>
-    </w:p>
-    <w:bookmarkEnd w:id="20"/>
+        <w:t xml:space="preserve">Incorrecto. La mediana está mal calculada.</w:t>
+      </w:r>
+    </w:p>
+    <w:bookmarkEnd w:id="100"/>
     <w:sectPr/>
   </w:body>
 </w:document>

</xml_diff>